<commit_message>
Task 3 done. No ERD for now
</commit_message>
<xml_diff>
--- a/Lab08 ERD Part2_DaoNguyenPhat_25DH110167.docx
+++ b/Lab08 ERD Part2_DaoNguyenPhat_25DH110167.docx
@@ -146,7 +146,6 @@
               <w:rPr>
                 <w:spacing w:val="0"/>
                 <w:position w:val="0"/>
-                <w:shd w:fill="auto" w:val="clear"/>
               </w:rPr>
             </w:pPr>
             <w:r>
@@ -187,7 +186,6 @@
               <w:rPr>
                 <w:spacing w:val="0"/>
                 <w:position w:val="0"/>
-                <w:shd w:fill="auto" w:val="clear"/>
               </w:rPr>
             </w:pPr>
             <w:r>
@@ -228,7 +226,6 @@
               <w:rPr>
                 <w:spacing w:val="0"/>
                 <w:position w:val="0"/>
-                <w:shd w:fill="auto" w:val="clear"/>
               </w:rPr>
             </w:pPr>
             <w:r>
@@ -269,7 +266,6 @@
               <w:rPr>
                 <w:spacing w:val="0"/>
                 <w:position w:val="0"/>
-                <w:shd w:fill="auto" w:val="clear"/>
               </w:rPr>
             </w:pPr>
             <w:r>
@@ -316,7 +312,6 @@
               <w:rPr>
                 <w:spacing w:val="0"/>
                 <w:position w:val="0"/>
-                <w:shd w:fill="auto" w:val="clear"/>
               </w:rPr>
             </w:pPr>
             <w:r>
@@ -357,7 +352,6 @@
               <w:rPr>
                 <w:spacing w:val="0"/>
                 <w:position w:val="0"/>
-                <w:shd w:fill="auto" w:val="clear"/>
               </w:rPr>
             </w:pPr>
             <w:r>
@@ -397,7 +391,6 @@
               <w:rPr>
                 <w:spacing w:val="0"/>
                 <w:position w:val="0"/>
-                <w:shd w:fill="auto" w:val="clear"/>
               </w:rPr>
             </w:pPr>
             <w:r>
@@ -437,7 +430,6 @@
               <w:rPr>
                 <w:spacing w:val="0"/>
                 <w:position w:val="0"/>
-                <w:shd w:fill="auto" w:val="clear"/>
               </w:rPr>
             </w:pPr>
             <w:r>
@@ -527,7 +519,6 @@
               <w:rPr>
                 <w:spacing w:val="0"/>
                 <w:position w:val="0"/>
-                <w:shd w:fill="auto" w:val="clear"/>
               </w:rPr>
             </w:pPr>
             <w:r>
@@ -568,7 +559,6 @@
               <w:rPr>
                 <w:spacing w:val="0"/>
                 <w:position w:val="0"/>
-                <w:shd w:fill="auto" w:val="clear"/>
               </w:rPr>
             </w:pPr>
             <w:r>
@@ -608,7 +598,6 @@
               <w:rPr>
                 <w:spacing w:val="0"/>
                 <w:position w:val="0"/>
-                <w:shd w:fill="auto" w:val="clear"/>
               </w:rPr>
             </w:pPr>
             <w:r>
@@ -648,7 +637,6 @@
               <w:rPr>
                 <w:spacing w:val="0"/>
                 <w:position w:val="0"/>
-                <w:shd w:fill="auto" w:val="clear"/>
               </w:rPr>
             </w:pPr>
             <w:r>
@@ -694,7 +682,6 @@
               <w:rPr>
                 <w:spacing w:val="0"/>
                 <w:position w:val="0"/>
-                <w:shd w:fill="auto" w:val="clear"/>
               </w:rPr>
             </w:pPr>
             <w:r>
@@ -735,7 +722,6 @@
               <w:rPr>
                 <w:spacing w:val="0"/>
                 <w:position w:val="0"/>
-                <w:shd w:fill="auto" w:val="clear"/>
               </w:rPr>
             </w:pPr>
             <w:r>
@@ -775,7 +761,6 @@
               <w:rPr>
                 <w:spacing w:val="0"/>
                 <w:position w:val="0"/>
-                <w:shd w:fill="auto" w:val="clear"/>
               </w:rPr>
             </w:pPr>
             <w:r>
@@ -815,7 +800,6 @@
               <w:rPr>
                 <w:spacing w:val="0"/>
                 <w:position w:val="0"/>
-                <w:shd w:fill="auto" w:val="clear"/>
               </w:rPr>
             </w:pPr>
             <w:r>
@@ -861,7 +845,6 @@
               <w:rPr>
                 <w:spacing w:val="0"/>
                 <w:position w:val="0"/>
-                <w:shd w:fill="auto" w:val="clear"/>
               </w:rPr>
             </w:pPr>
             <w:r>
@@ -902,7 +885,6 @@
               <w:rPr>
                 <w:spacing w:val="0"/>
                 <w:position w:val="0"/>
-                <w:shd w:fill="auto" w:val="clear"/>
               </w:rPr>
             </w:pPr>
             <w:r>
@@ -942,7 +924,6 @@
               <w:rPr>
                 <w:spacing w:val="0"/>
                 <w:position w:val="0"/>
-                <w:shd w:fill="auto" w:val="clear"/>
               </w:rPr>
             </w:pPr>
             <w:r>
@@ -982,7 +963,6 @@
               <w:rPr>
                 <w:spacing w:val="0"/>
                 <w:position w:val="0"/>
-                <w:shd w:fill="auto" w:val="clear"/>
               </w:rPr>
             </w:pPr>
             <w:r>
@@ -1269,7 +1249,6 @@
               <w:rPr>
                 <w:spacing w:val="0"/>
                 <w:position w:val="0"/>
-                <w:shd w:fill="auto" w:val="clear"/>
               </w:rPr>
             </w:pPr>
             <w:r>
@@ -1379,7 +1358,6 @@
               <w:rPr>
                 <w:spacing w:val="0"/>
                 <w:position w:val="0"/>
-                <w:shd w:fill="auto" w:val="clear"/>
               </w:rPr>
             </w:pPr>
             <w:r>
@@ -1420,7 +1398,6 @@
               <w:rPr>
                 <w:spacing w:val="0"/>
                 <w:position w:val="0"/>
-                <w:shd w:fill="auto" w:val="clear"/>
               </w:rPr>
             </w:pPr>
             <w:r>
@@ -1461,7 +1438,6 @@
               <w:rPr>
                 <w:spacing w:val="0"/>
                 <w:position w:val="0"/>
-                <w:shd w:fill="auto" w:val="clear"/>
               </w:rPr>
             </w:pPr>
             <w:r>
@@ -1502,7 +1478,6 @@
               <w:rPr>
                 <w:spacing w:val="0"/>
                 <w:position w:val="0"/>
-                <w:shd w:fill="auto" w:val="clear"/>
               </w:rPr>
             </w:pPr>
             <w:r>
@@ -1549,7 +1524,6 @@
               <w:rPr>
                 <w:spacing w:val="0"/>
                 <w:position w:val="0"/>
-                <w:shd w:fill="auto" w:val="clear"/>
               </w:rPr>
             </w:pPr>
             <w:r>
@@ -1593,7 +1567,6 @@
                 <w:spacing w:val="0"/>
                 <w:position w:val="0"/>
                 <w:sz w:val="22"/>
-                <w:shd w:fill="auto" w:val="clear"/>
               </w:rPr>
             </w:pPr>
             <w:r>
@@ -1636,7 +1609,6 @@
                 <w:spacing w:val="0"/>
                 <w:position w:val="0"/>
                 <w:sz w:val="22"/>
-                <w:shd w:fill="auto" w:val="clear"/>
               </w:rPr>
             </w:pPr>
             <w:r>
@@ -1714,7 +1686,6 @@
               <w:rPr>
                 <w:spacing w:val="0"/>
                 <w:position w:val="0"/>
-                <w:shd w:fill="auto" w:val="clear"/>
               </w:rPr>
             </w:pPr>
             <w:r>
@@ -1758,7 +1729,6 @@
                 <w:spacing w:val="0"/>
                 <w:position w:val="0"/>
                 <w:sz w:val="22"/>
-                <w:shd w:fill="auto" w:val="clear"/>
               </w:rPr>
             </w:pPr>
             <w:r>
@@ -1801,7 +1771,6 @@
                 <w:spacing w:val="0"/>
                 <w:position w:val="0"/>
                 <w:sz w:val="22"/>
-                <w:shd w:fill="auto" w:val="clear"/>
               </w:rPr>
             </w:pPr>
             <w:r>
@@ -1879,7 +1848,6 @@
               <w:rPr>
                 <w:spacing w:val="0"/>
                 <w:position w:val="0"/>
-                <w:shd w:fill="auto" w:val="clear"/>
               </w:rPr>
             </w:pPr>
             <w:r>
@@ -1923,7 +1891,6 @@
                 <w:spacing w:val="0"/>
                 <w:position w:val="0"/>
                 <w:sz w:val="22"/>
-                <w:shd w:fill="auto" w:val="clear"/>
               </w:rPr>
             </w:pPr>
             <w:r>
@@ -1966,7 +1933,6 @@
                 <w:spacing w:val="0"/>
                 <w:position w:val="0"/>
                 <w:sz w:val="22"/>
-                <w:shd w:fill="auto" w:val="clear"/>
               </w:rPr>
             </w:pPr>
             <w:r>
@@ -2044,7 +2010,6 @@
               <w:rPr>
                 <w:spacing w:val="0"/>
                 <w:position w:val="0"/>
-                <w:shd w:fill="auto" w:val="clear"/>
               </w:rPr>
             </w:pPr>
             <w:r>
@@ -2088,7 +2053,6 @@
                 <w:spacing w:val="0"/>
                 <w:position w:val="0"/>
                 <w:sz w:val="22"/>
-                <w:shd w:fill="auto" w:val="clear"/>
               </w:rPr>
             </w:pPr>
             <w:r>
@@ -2131,7 +2095,6 @@
                 <w:spacing w:val="0"/>
                 <w:position w:val="0"/>
                 <w:sz w:val="22"/>
-                <w:shd w:fill="auto" w:val="clear"/>
               </w:rPr>
             </w:pPr>
             <w:r>
@@ -2274,7 +2237,6 @@
               <w:rPr>
                 <w:spacing w:val="0"/>
                 <w:position w:val="0"/>
-                <w:shd w:fill="auto" w:val="clear"/>
               </w:rPr>
             </w:pPr>
             <w:r>
@@ -2315,7 +2277,6 @@
               <w:rPr>
                 <w:spacing w:val="0"/>
                 <w:position w:val="0"/>
-                <w:shd w:fill="auto" w:val="clear"/>
               </w:rPr>
             </w:pPr>
             <w:r>
@@ -2356,7 +2317,6 @@
               <w:rPr>
                 <w:spacing w:val="0"/>
                 <w:position w:val="0"/>
-                <w:shd w:fill="auto" w:val="clear"/>
               </w:rPr>
             </w:pPr>
             <w:r>
@@ -2397,7 +2357,6 @@
               <w:rPr>
                 <w:spacing w:val="0"/>
                 <w:position w:val="0"/>
-                <w:shd w:fill="auto" w:val="clear"/>
               </w:rPr>
             </w:pPr>
             <w:r>
@@ -2438,7 +2397,6 @@
               <w:rPr>
                 <w:spacing w:val="0"/>
                 <w:position w:val="0"/>
-                <w:shd w:fill="auto" w:val="clear"/>
               </w:rPr>
             </w:pPr>
             <w:r>
@@ -2485,7 +2443,6 @@
               <w:rPr>
                 <w:spacing w:val="0"/>
                 <w:position w:val="0"/>
-                <w:shd w:fill="auto" w:val="clear"/>
               </w:rPr>
             </w:pPr>
             <w:r>
@@ -2529,7 +2486,6 @@
                 <w:spacing w:val="0"/>
                 <w:position w:val="0"/>
                 <w:sz w:val="22"/>
-                <w:shd w:fill="auto" w:val="clear"/>
               </w:rPr>
             </w:pPr>
             <w:r>
@@ -2572,7 +2528,6 @@
                 <w:spacing w:val="0"/>
                 <w:position w:val="0"/>
                 <w:sz w:val="22"/>
-                <w:shd w:fill="auto" w:val="clear"/>
               </w:rPr>
             </w:pPr>
             <w:r>
@@ -2647,7 +2602,6 @@
                 <w:spacing w:val="0"/>
                 <w:position w:val="0"/>
                 <w:sz w:val="22"/>
-                <w:shd w:fill="auto" w:val="clear"/>
               </w:rPr>
             </w:pPr>
             <w:r>
@@ -2705,7 +2659,6 @@
               <w:rPr>
                 <w:spacing w:val="0"/>
                 <w:position w:val="0"/>
-                <w:shd w:fill="auto" w:val="clear"/>
               </w:rPr>
             </w:pPr>
             <w:r>
@@ -2749,7 +2702,6 @@
                 <w:spacing w:val="0"/>
                 <w:position w:val="0"/>
                 <w:sz w:val="22"/>
-                <w:shd w:fill="auto" w:val="clear"/>
               </w:rPr>
             </w:pPr>
             <w:r>
@@ -2792,7 +2744,6 @@
                 <w:spacing w:val="0"/>
                 <w:position w:val="0"/>
                 <w:sz w:val="22"/>
-                <w:shd w:fill="auto" w:val="clear"/>
               </w:rPr>
             </w:pPr>
             <w:r>
@@ -2835,7 +2786,6 @@
                 <w:spacing w:val="0"/>
                 <w:position w:val="0"/>
                 <w:sz w:val="22"/>
-                <w:shd w:fill="auto" w:val="clear"/>
               </w:rPr>
             </w:pPr>
             <w:r>
@@ -2878,7 +2828,6 @@
                 <w:spacing w:val="0"/>
                 <w:position w:val="0"/>
                 <w:sz w:val="22"/>
-                <w:shd w:fill="auto" w:val="clear"/>
               </w:rPr>
             </w:pPr>
             <w:r>
@@ -2936,7 +2885,6 @@
               <w:rPr>
                 <w:spacing w:val="0"/>
                 <w:position w:val="0"/>
-                <w:shd w:fill="auto" w:val="clear"/>
               </w:rPr>
             </w:pPr>
             <w:r>
@@ -2980,7 +2928,6 @@
                 <w:spacing w:val="0"/>
                 <w:position w:val="0"/>
                 <w:sz w:val="22"/>
-                <w:shd w:fill="auto" w:val="clear"/>
               </w:rPr>
             </w:pPr>
             <w:r>
@@ -3023,7 +2970,6 @@
                 <w:spacing w:val="0"/>
                 <w:position w:val="0"/>
                 <w:sz w:val="22"/>
-                <w:shd w:fill="auto" w:val="clear"/>
               </w:rPr>
             </w:pPr>
             <w:r>
@@ -3098,7 +3044,6 @@
                 <w:spacing w:val="0"/>
                 <w:position w:val="0"/>
                 <w:sz w:val="22"/>
-                <w:shd w:fill="auto" w:val="clear"/>
               </w:rPr>
             </w:pPr>
             <w:r>
@@ -3156,7 +3101,6 @@
               <w:rPr>
                 <w:spacing w:val="0"/>
                 <w:position w:val="0"/>
-                <w:shd w:fill="auto" w:val="clear"/>
               </w:rPr>
             </w:pPr>
             <w:r>
@@ -3200,7 +3144,6 @@
                 <w:spacing w:val="0"/>
                 <w:position w:val="0"/>
                 <w:sz w:val="22"/>
-                <w:shd w:fill="auto" w:val="clear"/>
               </w:rPr>
             </w:pPr>
             <w:r>
@@ -3243,7 +3186,6 @@
                 <w:spacing w:val="0"/>
                 <w:position w:val="0"/>
                 <w:sz w:val="22"/>
-                <w:shd w:fill="auto" w:val="clear"/>
               </w:rPr>
             </w:pPr>
             <w:r>
@@ -3318,7 +3260,6 @@
                 <w:spacing w:val="0"/>
                 <w:position w:val="0"/>
                 <w:sz w:val="22"/>
-                <w:shd w:fill="auto" w:val="clear"/>
               </w:rPr>
             </w:pPr>
             <w:r>
@@ -3376,7 +3317,6 @@
               <w:rPr>
                 <w:spacing w:val="0"/>
                 <w:position w:val="0"/>
-                <w:shd w:fill="auto" w:val="clear"/>
               </w:rPr>
             </w:pPr>
             <w:r>
@@ -3420,7 +3360,6 @@
                 <w:spacing w:val="0"/>
                 <w:position w:val="0"/>
                 <w:sz w:val="22"/>
-                <w:shd w:fill="auto" w:val="clear"/>
               </w:rPr>
             </w:pPr>
             <w:r>
@@ -3463,7 +3402,6 @@
                 <w:spacing w:val="0"/>
                 <w:position w:val="0"/>
                 <w:sz w:val="22"/>
-                <w:shd w:fill="auto" w:val="clear"/>
               </w:rPr>
             </w:pPr>
             <w:r>
@@ -3538,7 +3476,6 @@
                 <w:spacing w:val="0"/>
                 <w:position w:val="0"/>
                 <w:sz w:val="22"/>
-                <w:shd w:fill="auto" w:val="clear"/>
               </w:rPr>
             </w:pPr>
             <w:r>
@@ -3596,7 +3533,6 @@
               <w:rPr>
                 <w:spacing w:val="0"/>
                 <w:position w:val="0"/>
-                <w:shd w:fill="auto" w:val="clear"/>
               </w:rPr>
             </w:pPr>
             <w:r>
@@ -3640,7 +3576,6 @@
                 <w:spacing w:val="0"/>
                 <w:position w:val="0"/>
                 <w:sz w:val="22"/>
-                <w:shd w:fill="auto" w:val="clear"/>
               </w:rPr>
             </w:pPr>
             <w:r>
@@ -3683,7 +3618,6 @@
                 <w:spacing w:val="0"/>
                 <w:position w:val="0"/>
                 <w:sz w:val="22"/>
-                <w:shd w:fill="auto" w:val="clear"/>
               </w:rPr>
             </w:pPr>
             <w:r>
@@ -3758,7 +3692,6 @@
                 <w:spacing w:val="0"/>
                 <w:position w:val="0"/>
                 <w:sz w:val="22"/>
-                <w:shd w:fill="auto" w:val="clear"/>
               </w:rPr>
             </w:pPr>
             <w:r>
@@ -3816,7 +3749,6 @@
               <w:rPr>
                 <w:spacing w:val="0"/>
                 <w:position w:val="0"/>
-                <w:shd w:fill="auto" w:val="clear"/>
               </w:rPr>
             </w:pPr>
             <w:r>
@@ -4057,7 +3989,6 @@
               <w:rPr>
                 <w:spacing w:val="0"/>
                 <w:position w:val="0"/>
-                <w:shd w:fill="auto" w:val="clear"/>
               </w:rPr>
             </w:pPr>
             <w:r>
@@ -4098,7 +4029,6 @@
               <w:rPr>
                 <w:spacing w:val="0"/>
                 <w:position w:val="0"/>
-                <w:shd w:fill="auto" w:val="clear"/>
               </w:rPr>
             </w:pPr>
             <w:r>
@@ -4139,7 +4069,6 @@
               <w:rPr>
                 <w:spacing w:val="0"/>
                 <w:position w:val="0"/>
-                <w:shd w:fill="auto" w:val="clear"/>
               </w:rPr>
             </w:pPr>
             <w:r>
@@ -4180,7 +4109,6 @@
               <w:rPr>
                 <w:spacing w:val="0"/>
                 <w:position w:val="0"/>
-                <w:shd w:fill="auto" w:val="clear"/>
               </w:rPr>
             </w:pPr>
             <w:r>
@@ -4221,7 +4149,6 @@
               <w:rPr>
                 <w:spacing w:val="0"/>
                 <w:position w:val="0"/>
-                <w:shd w:fill="auto" w:val="clear"/>
               </w:rPr>
             </w:pPr>
             <w:r>
@@ -4262,7 +4189,6 @@
               <w:rPr>
                 <w:spacing w:val="0"/>
                 <w:position w:val="0"/>
-                <w:shd w:fill="auto" w:val="clear"/>
               </w:rPr>
             </w:pPr>
             <w:r>
@@ -4309,7 +4235,6 @@
               <w:rPr>
                 <w:spacing w:val="0"/>
                 <w:position w:val="0"/>
-                <w:shd w:fill="auto" w:val="clear"/>
               </w:rPr>
             </w:pPr>
             <w:r>
@@ -4353,7 +4278,6 @@
                 <w:spacing w:val="0"/>
                 <w:position w:val="0"/>
                 <w:sz w:val="22"/>
-                <w:shd w:fill="auto" w:val="clear"/>
               </w:rPr>
             </w:pPr>
             <w:r>
@@ -4396,7 +4320,6 @@
                 <w:spacing w:val="0"/>
                 <w:position w:val="0"/>
                 <w:sz w:val="22"/>
-                <w:shd w:fill="auto" w:val="clear"/>
               </w:rPr>
             </w:pPr>
             <w:r>
@@ -4439,7 +4362,6 @@
                 <w:spacing w:val="0"/>
                 <w:position w:val="0"/>
                 <w:sz w:val="22"/>
-                <w:shd w:fill="auto" w:val="clear"/>
               </w:rPr>
             </w:pPr>
             <w:r>
@@ -4482,7 +4404,6 @@
                 <w:spacing w:val="0"/>
                 <w:position w:val="0"/>
                 <w:sz w:val="22"/>
-                <w:shd w:fill="auto" w:val="clear"/>
               </w:rPr>
             </w:pPr>
             <w:r>
@@ -4560,7 +4481,6 @@
               <w:rPr>
                 <w:spacing w:val="0"/>
                 <w:position w:val="0"/>
-                <w:shd w:fill="auto" w:val="clear"/>
               </w:rPr>
             </w:pPr>
             <w:r>
@@ -4604,7 +4524,6 @@
                 <w:spacing w:val="0"/>
                 <w:position w:val="0"/>
                 <w:sz w:val="22"/>
-                <w:shd w:fill="auto" w:val="clear"/>
               </w:rPr>
             </w:pPr>
             <w:r>
@@ -4647,7 +4566,6 @@
                 <w:spacing w:val="0"/>
                 <w:position w:val="0"/>
                 <w:sz w:val="22"/>
-                <w:shd w:fill="auto" w:val="clear"/>
               </w:rPr>
             </w:pPr>
             <w:r>
@@ -4690,7 +4608,6 @@
                 <w:spacing w:val="0"/>
                 <w:position w:val="0"/>
                 <w:sz w:val="22"/>
-                <w:shd w:fill="auto" w:val="clear"/>
               </w:rPr>
             </w:pPr>
             <w:r>
@@ -4733,7 +4650,6 @@
                 <w:spacing w:val="0"/>
                 <w:position w:val="0"/>
                 <w:sz w:val="22"/>
-                <w:shd w:fill="auto" w:val="clear"/>
               </w:rPr>
             </w:pPr>
             <w:r>
@@ -4811,7 +4727,6 @@
               <w:rPr>
                 <w:spacing w:val="0"/>
                 <w:position w:val="0"/>
-                <w:shd w:fill="auto" w:val="clear"/>
               </w:rPr>
             </w:pPr>
             <w:r>
@@ -4855,7 +4770,6 @@
                 <w:spacing w:val="0"/>
                 <w:position w:val="0"/>
                 <w:sz w:val="22"/>
-                <w:shd w:fill="auto" w:val="clear"/>
               </w:rPr>
             </w:pPr>
             <w:r>
@@ -4898,7 +4812,6 @@
                 <w:spacing w:val="0"/>
                 <w:position w:val="0"/>
                 <w:sz w:val="22"/>
-                <w:shd w:fill="auto" w:val="clear"/>
               </w:rPr>
             </w:pPr>
             <w:r>
@@ -4941,7 +4854,6 @@
                 <w:spacing w:val="0"/>
                 <w:position w:val="0"/>
                 <w:sz w:val="22"/>
-                <w:shd w:fill="auto" w:val="clear"/>
               </w:rPr>
             </w:pPr>
             <w:r>
@@ -4984,7 +4896,6 @@
                 <w:spacing w:val="0"/>
                 <w:position w:val="0"/>
                 <w:sz w:val="22"/>
-                <w:shd w:fill="auto" w:val="clear"/>
               </w:rPr>
             </w:pPr>
             <w:r>
@@ -5062,7 +4973,6 @@
               <w:rPr>
                 <w:spacing w:val="0"/>
                 <w:position w:val="0"/>
-                <w:shd w:fill="auto" w:val="clear"/>
               </w:rPr>
             </w:pPr>
             <w:r>
@@ -5106,7 +5016,6 @@
                 <w:spacing w:val="0"/>
                 <w:position w:val="0"/>
                 <w:sz w:val="22"/>
-                <w:shd w:fill="auto" w:val="clear"/>
               </w:rPr>
             </w:pPr>
             <w:r>
@@ -5149,7 +5058,6 @@
                 <w:spacing w:val="0"/>
                 <w:position w:val="0"/>
                 <w:sz w:val="22"/>
-                <w:shd w:fill="auto" w:val="clear"/>
               </w:rPr>
             </w:pPr>
             <w:r>
@@ -5192,7 +5100,6 @@
                 <w:spacing w:val="0"/>
                 <w:position w:val="0"/>
                 <w:sz w:val="22"/>
-                <w:shd w:fill="auto" w:val="clear"/>
               </w:rPr>
             </w:pPr>
             <w:r>
@@ -5235,7 +5142,6 @@
                 <w:spacing w:val="0"/>
                 <w:position w:val="0"/>
                 <w:sz w:val="22"/>
-                <w:shd w:fill="auto" w:val="clear"/>
               </w:rPr>
             </w:pPr>
             <w:r>
@@ -5313,7 +5219,6 @@
               <w:rPr>
                 <w:spacing w:val="0"/>
                 <w:position w:val="0"/>
-                <w:shd w:fill="auto" w:val="clear"/>
               </w:rPr>
             </w:pPr>
             <w:r>
@@ -5357,7 +5262,6 @@
                 <w:spacing w:val="0"/>
                 <w:position w:val="0"/>
                 <w:sz w:val="22"/>
-                <w:shd w:fill="auto" w:val="clear"/>
               </w:rPr>
             </w:pPr>
             <w:r>
@@ -5400,7 +5304,6 @@
                 <w:spacing w:val="0"/>
                 <w:position w:val="0"/>
                 <w:sz w:val="22"/>
-                <w:shd w:fill="auto" w:val="clear"/>
               </w:rPr>
             </w:pPr>
             <w:r>
@@ -5443,7 +5346,6 @@
                 <w:spacing w:val="0"/>
                 <w:position w:val="0"/>
                 <w:sz w:val="22"/>
-                <w:shd w:fill="auto" w:val="clear"/>
               </w:rPr>
             </w:pPr>
             <w:r>
@@ -5486,7 +5388,6 @@
                 <w:spacing w:val="0"/>
                 <w:position w:val="0"/>
                 <w:sz w:val="22"/>
-                <w:shd w:fill="auto" w:val="clear"/>
               </w:rPr>
             </w:pPr>
             <w:r>
@@ -5564,7 +5465,6 @@
               <w:rPr>
                 <w:spacing w:val="0"/>
                 <w:position w:val="0"/>
-                <w:shd w:fill="auto" w:val="clear"/>
               </w:rPr>
             </w:pPr>
             <w:r>
@@ -5771,7 +5671,6 @@
               <w:rPr>
                 <w:spacing w:val="0"/>
                 <w:position w:val="0"/>
-                <w:shd w:fill="auto" w:val="clear"/>
               </w:rPr>
             </w:pPr>
             <w:r>
@@ -6314,7 +6213,6 @@
               <w:rPr>
                 <w:spacing w:val="0"/>
                 <w:position w:val="0"/>
-                <w:shd w:fill="auto" w:val="clear"/>
               </w:rPr>
             </w:pPr>
             <w:r>
@@ -6424,7 +6322,6 @@
               <w:rPr>
                 <w:spacing w:val="0"/>
                 <w:position w:val="0"/>
-                <w:shd w:fill="auto" w:val="clear"/>
               </w:rPr>
             </w:pPr>
             <w:r>
@@ -6465,7 +6362,6 @@
               <w:rPr>
                 <w:spacing w:val="0"/>
                 <w:position w:val="0"/>
-                <w:shd w:fill="auto" w:val="clear"/>
               </w:rPr>
             </w:pPr>
             <w:r>
@@ -6506,7 +6402,6 @@
               <w:rPr>
                 <w:spacing w:val="0"/>
                 <w:position w:val="0"/>
-                <w:shd w:fill="auto" w:val="clear"/>
               </w:rPr>
             </w:pPr>
             <w:r>
@@ -6547,7 +6442,6 @@
               <w:rPr>
                 <w:spacing w:val="0"/>
                 <w:position w:val="0"/>
-                <w:shd w:fill="auto" w:val="clear"/>
               </w:rPr>
             </w:pPr>
             <w:r>
@@ -6594,7 +6488,6 @@
               <w:rPr>
                 <w:spacing w:val="0"/>
                 <w:position w:val="0"/>
-                <w:shd w:fill="auto" w:val="clear"/>
               </w:rPr>
             </w:pPr>
             <w:r>
@@ -6664,7 +6557,6 @@
                 <w:spacing w:val="0"/>
                 <w:position w:val="0"/>
                 <w:sz w:val="22"/>
-                <w:shd w:fill="auto" w:val="clear"/>
               </w:rPr>
             </w:pPr>
             <w:r>
@@ -6707,7 +6599,6 @@
                 <w:spacing w:val="0"/>
                 <w:position w:val="0"/>
                 <w:sz w:val="22"/>
-                <w:shd w:fill="auto" w:val="clear"/>
               </w:rPr>
             </w:pPr>
             <w:r>
@@ -6785,7 +6676,6 @@
               <w:rPr>
                 <w:spacing w:val="0"/>
                 <w:position w:val="0"/>
-                <w:shd w:fill="auto" w:val="clear"/>
               </w:rPr>
             </w:pPr>
             <w:r>
@@ -6829,7 +6719,6 @@
                 <w:spacing w:val="0"/>
                 <w:position w:val="0"/>
                 <w:sz w:val="22"/>
-                <w:shd w:fill="auto" w:val="clear"/>
               </w:rPr>
             </w:pPr>
             <w:r>
@@ -6872,7 +6761,6 @@
                 <w:spacing w:val="0"/>
                 <w:position w:val="0"/>
                 <w:sz w:val="22"/>
-                <w:shd w:fill="auto" w:val="clear"/>
               </w:rPr>
             </w:pPr>
             <w:r>
@@ -6950,7 +6838,6 @@
               <w:rPr>
                 <w:spacing w:val="0"/>
                 <w:position w:val="0"/>
-                <w:shd w:fill="auto" w:val="clear"/>
               </w:rPr>
             </w:pPr>
             <w:r>
@@ -7072,7 +6959,6 @@
                 <w:spacing w:val="0"/>
                 <w:position w:val="0"/>
                 <w:sz w:val="22"/>
-                <w:shd w:fill="auto" w:val="clear"/>
               </w:rPr>
             </w:pPr>
             <w:r>
@@ -7141,7 +7027,6 @@
                 <w:spacing w:val="0"/>
                 <w:position w:val="0"/>
                 <w:sz w:val="22"/>
-                <w:shd w:fill="auto" w:val="clear"/>
               </w:rPr>
             </w:pPr>
             <w:r>
@@ -7219,7 +7104,6 @@
               <w:rPr>
                 <w:spacing w:val="0"/>
                 <w:position w:val="0"/>
-                <w:shd w:fill="auto" w:val="clear"/>
               </w:rPr>
             </w:pPr>
             <w:r>
@@ -7263,7 +7147,6 @@
                 <w:spacing w:val="0"/>
                 <w:position w:val="0"/>
                 <w:sz w:val="22"/>
-                <w:shd w:fill="auto" w:val="clear"/>
               </w:rPr>
             </w:pPr>
             <w:r>
@@ -7306,7 +7189,6 @@
                 <w:spacing w:val="0"/>
                 <w:position w:val="0"/>
                 <w:sz w:val="22"/>
-                <w:shd w:fill="auto" w:val="clear"/>
               </w:rPr>
             </w:pPr>
             <w:r>
@@ -7449,7 +7331,6 @@
               <w:rPr>
                 <w:spacing w:val="0"/>
                 <w:position w:val="0"/>
-                <w:shd w:fill="auto" w:val="clear"/>
               </w:rPr>
             </w:pPr>
             <w:r>
@@ -7490,7 +7371,6 @@
               <w:rPr>
                 <w:spacing w:val="0"/>
                 <w:position w:val="0"/>
-                <w:shd w:fill="auto" w:val="clear"/>
               </w:rPr>
             </w:pPr>
             <w:r>
@@ -7531,7 +7411,6 @@
               <w:rPr>
                 <w:spacing w:val="0"/>
                 <w:position w:val="0"/>
-                <w:shd w:fill="auto" w:val="clear"/>
               </w:rPr>
             </w:pPr>
             <w:r>
@@ -7572,7 +7451,6 @@
               <w:rPr>
                 <w:spacing w:val="0"/>
                 <w:position w:val="0"/>
-                <w:shd w:fill="auto" w:val="clear"/>
               </w:rPr>
             </w:pPr>
             <w:r>
@@ -7613,7 +7491,6 @@
               <w:rPr>
                 <w:spacing w:val="0"/>
                 <w:position w:val="0"/>
-                <w:shd w:fill="auto" w:val="clear"/>
               </w:rPr>
             </w:pPr>
             <w:r>
@@ -7660,7 +7537,6 @@
               <w:rPr>
                 <w:spacing w:val="0"/>
                 <w:position w:val="0"/>
-                <w:shd w:fill="auto" w:val="clear"/>
               </w:rPr>
             </w:pPr>
             <w:r>
@@ -7704,7 +7580,6 @@
                 <w:spacing w:val="0"/>
                 <w:position w:val="0"/>
                 <w:sz w:val="22"/>
-                <w:shd w:fill="auto" w:val="clear"/>
               </w:rPr>
             </w:pPr>
             <w:r>
@@ -7747,7 +7622,6 @@
                 <w:spacing w:val="0"/>
                 <w:position w:val="0"/>
                 <w:sz w:val="22"/>
-                <w:shd w:fill="auto" w:val="clear"/>
               </w:rPr>
             </w:pPr>
             <w:r>
@@ -7822,7 +7696,6 @@
                 <w:spacing w:val="0"/>
                 <w:position w:val="0"/>
                 <w:sz w:val="22"/>
-                <w:shd w:fill="auto" w:val="clear"/>
               </w:rPr>
             </w:pPr>
             <w:r>
@@ -7880,7 +7753,6 @@
               <w:rPr>
                 <w:spacing w:val="0"/>
                 <w:position w:val="0"/>
-                <w:shd w:fill="auto" w:val="clear"/>
               </w:rPr>
             </w:pPr>
             <w:r>
@@ -7924,7 +7796,6 @@
                 <w:spacing w:val="0"/>
                 <w:position w:val="0"/>
                 <w:sz w:val="22"/>
-                <w:shd w:fill="auto" w:val="clear"/>
               </w:rPr>
             </w:pPr>
             <w:r>
@@ -7967,7 +7838,6 @@
                 <w:spacing w:val="0"/>
                 <w:position w:val="0"/>
                 <w:sz w:val="22"/>
-                <w:shd w:fill="auto" w:val="clear"/>
               </w:rPr>
             </w:pPr>
             <w:r>
@@ -8010,7 +7880,6 @@
                 <w:spacing w:val="0"/>
                 <w:position w:val="0"/>
                 <w:sz w:val="22"/>
-                <w:shd w:fill="auto" w:val="clear"/>
               </w:rPr>
             </w:pPr>
             <w:r>
@@ -8053,7 +7922,6 @@
                 <w:spacing w:val="0"/>
                 <w:position w:val="0"/>
                 <w:sz w:val="22"/>
-                <w:shd w:fill="auto" w:val="clear"/>
               </w:rPr>
             </w:pPr>
             <w:r>
@@ -8111,7 +7979,6 @@
               <w:rPr>
                 <w:spacing w:val="0"/>
                 <w:position w:val="0"/>
-                <w:shd w:fill="auto" w:val="clear"/>
               </w:rPr>
             </w:pPr>
             <w:r>
@@ -8155,7 +8022,6 @@
                 <w:spacing w:val="0"/>
                 <w:position w:val="0"/>
                 <w:sz w:val="22"/>
-                <w:shd w:fill="auto" w:val="clear"/>
               </w:rPr>
             </w:pPr>
             <w:r>
@@ -8198,7 +8064,6 @@
                 <w:spacing w:val="0"/>
                 <w:position w:val="0"/>
                 <w:sz w:val="22"/>
-                <w:shd w:fill="auto" w:val="clear"/>
               </w:rPr>
             </w:pPr>
             <w:r>
@@ -8273,7 +8138,6 @@
                 <w:spacing w:val="0"/>
                 <w:position w:val="0"/>
                 <w:sz w:val="22"/>
-                <w:shd w:fill="auto" w:val="clear"/>
               </w:rPr>
             </w:pPr>
             <w:r>
@@ -8331,7 +8195,6 @@
               <w:rPr>
                 <w:spacing w:val="0"/>
                 <w:position w:val="0"/>
-                <w:shd w:fill="auto" w:val="clear"/>
               </w:rPr>
             </w:pPr>
             <w:r>
@@ -8375,7 +8238,6 @@
                 <w:spacing w:val="0"/>
                 <w:position w:val="0"/>
                 <w:sz w:val="22"/>
-                <w:shd w:fill="auto" w:val="clear"/>
               </w:rPr>
             </w:pPr>
             <w:r>
@@ -8418,7 +8280,6 @@
                 <w:spacing w:val="0"/>
                 <w:position w:val="0"/>
                 <w:sz w:val="22"/>
-                <w:shd w:fill="auto" w:val="clear"/>
               </w:rPr>
             </w:pPr>
             <w:r>
@@ -8493,7 +8354,6 @@
                 <w:spacing w:val="0"/>
                 <w:position w:val="0"/>
                 <w:sz w:val="22"/>
-                <w:shd w:fill="auto" w:val="clear"/>
               </w:rPr>
             </w:pPr>
             <w:r>
@@ -8551,7 +8411,6 @@
               <w:rPr>
                 <w:spacing w:val="0"/>
                 <w:position w:val="0"/>
-                <w:shd w:fill="auto" w:val="clear"/>
               </w:rPr>
             </w:pPr>
             <w:r>
@@ -8595,7 +8454,6 @@
                 <w:spacing w:val="0"/>
                 <w:position w:val="0"/>
                 <w:sz w:val="22"/>
-                <w:shd w:fill="auto" w:val="clear"/>
               </w:rPr>
             </w:pPr>
             <w:r>
@@ -8638,7 +8496,6 @@
                 <w:spacing w:val="0"/>
                 <w:position w:val="0"/>
                 <w:sz w:val="22"/>
-                <w:shd w:fill="auto" w:val="clear"/>
               </w:rPr>
             </w:pPr>
             <w:r>
@@ -8713,7 +8570,6 @@
                 <w:spacing w:val="0"/>
                 <w:position w:val="0"/>
                 <w:sz w:val="22"/>
-                <w:shd w:fill="auto" w:val="clear"/>
               </w:rPr>
             </w:pPr>
             <w:r>
@@ -8771,7 +8627,6 @@
               <w:rPr>
                 <w:spacing w:val="0"/>
                 <w:position w:val="0"/>
-                <w:shd w:fill="auto" w:val="clear"/>
               </w:rPr>
             </w:pPr>
             <w:r>
@@ -8815,7 +8670,6 @@
                 <w:spacing w:val="0"/>
                 <w:position w:val="0"/>
                 <w:sz w:val="22"/>
-                <w:shd w:fill="auto" w:val="clear"/>
               </w:rPr>
             </w:pPr>
             <w:r>
@@ -8858,7 +8712,6 @@
                 <w:spacing w:val="0"/>
                 <w:position w:val="0"/>
                 <w:sz w:val="22"/>
-                <w:shd w:fill="auto" w:val="clear"/>
               </w:rPr>
             </w:pPr>
             <w:r>
@@ -8933,7 +8786,6 @@
                 <w:spacing w:val="0"/>
                 <w:position w:val="0"/>
                 <w:sz w:val="22"/>
-                <w:shd w:fill="auto" w:val="clear"/>
               </w:rPr>
             </w:pPr>
             <w:r>
@@ -8991,7 +8843,6 @@
               <w:rPr>
                 <w:spacing w:val="0"/>
                 <w:position w:val="0"/>
-                <w:shd w:fill="auto" w:val="clear"/>
               </w:rPr>
             </w:pPr>
             <w:r>
@@ -9232,7 +9083,6 @@
               <w:rPr>
                 <w:spacing w:val="0"/>
                 <w:position w:val="0"/>
-                <w:shd w:fill="auto" w:val="clear"/>
               </w:rPr>
             </w:pPr>
             <w:r>
@@ -9273,7 +9123,6 @@
               <w:rPr>
                 <w:spacing w:val="0"/>
                 <w:position w:val="0"/>
-                <w:shd w:fill="auto" w:val="clear"/>
               </w:rPr>
             </w:pPr>
             <w:r>
@@ -9314,7 +9163,6 @@
               <w:rPr>
                 <w:spacing w:val="0"/>
                 <w:position w:val="0"/>
-                <w:shd w:fill="auto" w:val="clear"/>
               </w:rPr>
             </w:pPr>
             <w:r>
@@ -9355,7 +9203,6 @@
               <w:rPr>
                 <w:spacing w:val="0"/>
                 <w:position w:val="0"/>
-                <w:shd w:fill="auto" w:val="clear"/>
               </w:rPr>
             </w:pPr>
             <w:r>
@@ -9396,7 +9243,6 @@
               <w:rPr>
                 <w:spacing w:val="0"/>
                 <w:position w:val="0"/>
-                <w:shd w:fill="auto" w:val="clear"/>
               </w:rPr>
             </w:pPr>
             <w:r>
@@ -9437,7 +9283,6 @@
               <w:rPr>
                 <w:spacing w:val="0"/>
                 <w:position w:val="0"/>
-                <w:shd w:fill="auto" w:val="clear"/>
               </w:rPr>
             </w:pPr>
             <w:r>
@@ -9484,7 +9329,6 @@
               <w:rPr>
                 <w:spacing w:val="0"/>
                 <w:position w:val="0"/>
-                <w:shd w:fill="auto" w:val="clear"/>
               </w:rPr>
             </w:pPr>
             <w:r>
@@ -9528,7 +9372,6 @@
                 <w:spacing w:val="0"/>
                 <w:position w:val="0"/>
                 <w:sz w:val="22"/>
-                <w:shd w:fill="auto" w:val="clear"/>
               </w:rPr>
             </w:pPr>
             <w:r>
@@ -9597,7 +9440,6 @@
                 <w:spacing w:val="0"/>
                 <w:position w:val="0"/>
                 <w:sz w:val="22"/>
-                <w:shd w:fill="auto" w:val="clear"/>
               </w:rPr>
             </w:pPr>
             <w:r>
@@ -9640,7 +9482,6 @@
                 <w:spacing w:val="0"/>
                 <w:position w:val="0"/>
                 <w:sz w:val="22"/>
-                <w:shd w:fill="auto" w:val="clear"/>
               </w:rPr>
             </w:pPr>
             <w:r>
@@ -9750,7 +9591,6 @@
               <w:rPr>
                 <w:spacing w:val="0"/>
                 <w:position w:val="0"/>
-                <w:shd w:fill="auto" w:val="clear"/>
               </w:rPr>
             </w:pPr>
             <w:r>
@@ -9794,7 +9634,6 @@
                 <w:spacing w:val="0"/>
                 <w:position w:val="0"/>
                 <w:sz w:val="22"/>
-                <w:shd w:fill="auto" w:val="clear"/>
               </w:rPr>
             </w:pPr>
             <w:r>
@@ -9863,7 +9702,6 @@
                 <w:spacing w:val="0"/>
                 <w:position w:val="0"/>
                 <w:sz w:val="22"/>
-                <w:shd w:fill="auto" w:val="clear"/>
               </w:rPr>
             </w:pPr>
             <w:r>
@@ -9906,7 +9744,6 @@
                 <w:spacing w:val="0"/>
                 <w:position w:val="0"/>
                 <w:sz w:val="22"/>
-                <w:shd w:fill="auto" w:val="clear"/>
               </w:rPr>
             </w:pPr>
             <w:r>
@@ -10016,7 +9853,6 @@
               <w:rPr>
                 <w:spacing w:val="0"/>
                 <w:position w:val="0"/>
-                <w:shd w:fill="auto" w:val="clear"/>
               </w:rPr>
             </w:pPr>
             <w:r>
@@ -10060,7 +9896,6 @@
                 <w:spacing w:val="0"/>
                 <w:position w:val="0"/>
                 <w:sz w:val="22"/>
-                <w:shd w:fill="auto" w:val="clear"/>
               </w:rPr>
             </w:pPr>
             <w:r>
@@ -10103,7 +9938,6 @@
                 <w:spacing w:val="0"/>
                 <w:position w:val="0"/>
                 <w:sz w:val="22"/>
-                <w:shd w:fill="auto" w:val="clear"/>
               </w:rPr>
             </w:pPr>
             <w:r>
@@ -10146,7 +9980,6 @@
                 <w:spacing w:val="0"/>
                 <w:position w:val="0"/>
                 <w:sz w:val="22"/>
-                <w:shd w:fill="auto" w:val="clear"/>
               </w:rPr>
             </w:pPr>
             <w:r>
@@ -10256,7 +10089,6 @@
               <w:rPr>
                 <w:spacing w:val="0"/>
                 <w:position w:val="0"/>
-                <w:shd w:fill="auto" w:val="clear"/>
               </w:rPr>
             </w:pPr>
             <w:r>
@@ -10300,7 +10132,6 @@
                 <w:spacing w:val="0"/>
                 <w:position w:val="0"/>
                 <w:sz w:val="22"/>
-                <w:shd w:fill="auto" w:val="clear"/>
               </w:rPr>
             </w:pPr>
             <w:r>
@@ -10369,7 +10200,6 @@
                 <w:spacing w:val="0"/>
                 <w:position w:val="0"/>
                 <w:sz w:val="22"/>
-                <w:shd w:fill="auto" w:val="clear"/>
               </w:rPr>
             </w:pPr>
             <w:r>
@@ -10412,7 +10242,6 @@
                 <w:spacing w:val="0"/>
                 <w:position w:val="0"/>
                 <w:sz w:val="22"/>
-                <w:shd w:fill="auto" w:val="clear"/>
               </w:rPr>
             </w:pPr>
             <w:r>
@@ -10522,7 +10351,6 @@
               <w:rPr>
                 <w:spacing w:val="0"/>
                 <w:position w:val="0"/>
-                <w:shd w:fill="auto" w:val="clear"/>
               </w:rPr>
             </w:pPr>
             <w:r>
@@ -10566,7 +10394,6 @@
                 <w:spacing w:val="0"/>
                 <w:position w:val="0"/>
                 <w:sz w:val="22"/>
-                <w:shd w:fill="auto" w:val="clear"/>
               </w:rPr>
             </w:pPr>
             <w:r>
@@ -10635,7 +10462,6 @@
                 <w:spacing w:val="0"/>
                 <w:position w:val="0"/>
                 <w:sz w:val="22"/>
-                <w:shd w:fill="auto" w:val="clear"/>
               </w:rPr>
             </w:pPr>
             <w:r>
@@ -10678,7 +10504,6 @@
                 <w:spacing w:val="0"/>
                 <w:position w:val="0"/>
                 <w:sz w:val="22"/>
-                <w:shd w:fill="auto" w:val="clear"/>
               </w:rPr>
             </w:pPr>
             <w:r>
@@ -10788,7 +10613,6 @@
               <w:rPr>
                 <w:spacing w:val="0"/>
                 <w:position w:val="0"/>
-                <w:shd w:fill="auto" w:val="clear"/>
               </w:rPr>
             </w:pPr>
             <w:r>
@@ -10832,7 +10656,6 @@
                 <w:spacing w:val="0"/>
                 <w:position w:val="0"/>
                 <w:sz w:val="22"/>
-                <w:shd w:fill="auto" w:val="clear"/>
               </w:rPr>
             </w:pPr>
             <w:r>
@@ -10875,7 +10698,6 @@
                 <w:spacing w:val="0"/>
                 <w:position w:val="0"/>
                 <w:sz w:val="22"/>
-                <w:shd w:fill="auto" w:val="clear"/>
               </w:rPr>
             </w:pPr>
             <w:r>
@@ -10918,7 +10740,6 @@
                 <w:spacing w:val="0"/>
                 <w:position w:val="0"/>
                 <w:sz w:val="22"/>
-                <w:shd w:fill="auto" w:val="clear"/>
               </w:rPr>
             </w:pPr>
             <w:r>
@@ -11028,7 +10849,6 @@
               <w:rPr>
                 <w:spacing w:val="0"/>
                 <w:position w:val="0"/>
-                <w:shd w:fill="auto" w:val="clear"/>
               </w:rPr>
             </w:pPr>
             <w:r>
@@ -11584,7 +11404,6 @@
               <w:rPr>
                 <w:spacing w:val="0"/>
                 <w:position w:val="0"/>
-                <w:shd w:fill="auto" w:val="clear"/>
               </w:rPr>
             </w:pPr>
             <w:r>
@@ -11709,7 +11528,6 @@
               <w:rPr>
                 <w:spacing w:val="0"/>
                 <w:position w:val="0"/>
-                <w:shd w:fill="auto" w:val="clear"/>
               </w:rPr>
             </w:pPr>
             <w:r>
@@ -11750,7 +11568,6 @@
               <w:rPr>
                 <w:spacing w:val="0"/>
                 <w:position w:val="0"/>
-                <w:shd w:fill="auto" w:val="clear"/>
               </w:rPr>
             </w:pPr>
             <w:r>
@@ -11791,7 +11608,6 @@
               <w:rPr>
                 <w:spacing w:val="0"/>
                 <w:position w:val="0"/>
-                <w:shd w:fill="auto" w:val="clear"/>
               </w:rPr>
             </w:pPr>
             <w:r>
@@ -11832,7 +11648,6 @@
               <w:rPr>
                 <w:spacing w:val="0"/>
                 <w:position w:val="0"/>
-                <w:shd w:fill="auto" w:val="clear"/>
               </w:rPr>
             </w:pPr>
             <w:r>
@@ -11879,7 +11694,6 @@
               <w:rPr>
                 <w:spacing w:val="0"/>
                 <w:position w:val="0"/>
-                <w:shd w:fill="auto" w:val="clear"/>
               </w:rPr>
             </w:pPr>
             <w:r>
@@ -11926,6 +11740,43 @@
                 <w:shd w:fill="auto" w:val="clear"/>
               </w:rPr>
             </w:pPr>
+            <w:r>
+              <w:rPr>
+                <w:rFonts w:ascii="Calibri" w:hAnsi="Calibri" w:cs="Calibri" w:eastAsia="Calibri"/>
+                <w:color w:val="auto"/>
+                <w:spacing w:val="0"/>
+                <w:position w:val="0"/>
+                <w:sz w:val="22"/>
+                <w:shd w:fill="auto" w:val="clear"/>
+              </w:rPr>
+              <w:t xml:space="preserve">Location, Full name,</w:t>
+            </w:r>
+          </w:p>
+          <w:p>
+            <w:pPr>
+              <w:spacing w:before="0" w:after="0" w:line="560"/>
+              <w:ind w:right="0" w:left="0" w:firstLine="0"/>
+              <w:jc w:val="left"/>
+              <w:rPr>
+                <w:rFonts w:ascii="Calibri" w:hAnsi="Calibri" w:cs="Calibri" w:eastAsia="Calibri"/>
+                <w:color w:val="auto"/>
+                <w:spacing w:val="0"/>
+                <w:position w:val="0"/>
+                <w:sz w:val="22"/>
+                <w:shd w:fill="auto" w:val="clear"/>
+              </w:rPr>
+            </w:pPr>
+            <w:r>
+              <w:rPr>
+                <w:rFonts w:ascii="Calibri" w:hAnsi="Calibri" w:cs="Calibri" w:eastAsia="Calibri"/>
+                <w:color w:val="auto"/>
+                <w:spacing w:val="0"/>
+                <w:position w:val="0"/>
+                <w:sz w:val="22"/>
+                <w:shd w:fill="auto" w:val="clear"/>
+              </w:rPr>
+              <w:t xml:space="preserve">Home address</w:t>
+            </w:r>
           </w:p>
         </w:tc>
         <w:tc>
@@ -11958,6 +11809,43 @@
                 <w:shd w:fill="auto" w:val="clear"/>
               </w:rPr>
             </w:pPr>
+            <w:r>
+              <w:rPr>
+                <w:rFonts w:ascii="Calibri" w:hAnsi="Calibri" w:cs="Calibri" w:eastAsia="Calibri"/>
+                <w:color w:val="auto"/>
+                <w:spacing w:val="0"/>
+                <w:position w:val="0"/>
+                <w:sz w:val="22"/>
+                <w:shd w:fill="auto" w:val="clear"/>
+              </w:rPr>
+              <w:t xml:space="preserve">DEPARTMENT,</w:t>
+            </w:r>
+          </w:p>
+          <w:p>
+            <w:pPr>
+              <w:spacing w:before="0" w:after="0" w:line="560"/>
+              <w:ind w:right="0" w:left="0" w:firstLine="0"/>
+              <w:jc w:val="left"/>
+              <w:rPr>
+                <w:rFonts w:ascii="Calibri" w:hAnsi="Calibri" w:cs="Calibri" w:eastAsia="Calibri"/>
+                <w:color w:val="auto"/>
+                <w:spacing w:val="0"/>
+                <w:position w:val="0"/>
+                <w:sz w:val="22"/>
+                <w:shd w:fill="auto" w:val="clear"/>
+              </w:rPr>
+            </w:pPr>
+            <w:r>
+              <w:rPr>
+                <w:rFonts w:ascii="Calibri" w:hAnsi="Calibri" w:cs="Calibri" w:eastAsia="Calibri"/>
+                <w:color w:val="auto"/>
+                <w:spacing w:val="0"/>
+                <w:position w:val="0"/>
+                <w:sz w:val="22"/>
+                <w:shd w:fill="auto" w:val="clear"/>
+              </w:rPr>
+              <w:t xml:space="preserve">EMPLOYEE</w:t>
+            </w:r>
           </w:p>
         </w:tc>
         <w:tc>
@@ -12022,7 +11910,6 @@
               <w:rPr>
                 <w:spacing w:val="0"/>
                 <w:position w:val="0"/>
-                <w:shd w:fill="auto" w:val="clear"/>
               </w:rPr>
             </w:pPr>
             <w:r>
@@ -12069,6 +11956,17 @@
                 <w:shd w:fill="auto" w:val="clear"/>
               </w:rPr>
             </w:pPr>
+            <w:r>
+              <w:rPr>
+                <w:rFonts w:ascii="Calibri" w:hAnsi="Calibri" w:cs="Calibri" w:eastAsia="Calibri"/>
+                <w:color w:val="auto"/>
+                <w:spacing w:val="0"/>
+                <w:position w:val="0"/>
+                <w:sz w:val="22"/>
+                <w:shd w:fill="auto" w:val="clear"/>
+              </w:rPr>
+              <w:t xml:space="preserve">Skill</w:t>
+            </w:r>
           </w:p>
         </w:tc>
         <w:tc>
@@ -12101,6 +11999,17 @@
                 <w:shd w:fill="auto" w:val="clear"/>
               </w:rPr>
             </w:pPr>
+            <w:r>
+              <w:rPr>
+                <w:rFonts w:ascii="Calibri" w:hAnsi="Calibri" w:cs="Calibri" w:eastAsia="Calibri"/>
+                <w:color w:val="auto"/>
+                <w:spacing w:val="0"/>
+                <w:position w:val="0"/>
+                <w:sz w:val="22"/>
+                <w:shd w:fill="auto" w:val="clear"/>
+              </w:rPr>
+              <w:t xml:space="preserve">EMPLOYEE</w:t>
+            </w:r>
           </w:p>
         </w:tc>
         <w:tc>
@@ -12165,7 +12074,6 @@
               <w:rPr>
                 <w:spacing w:val="0"/>
                 <w:position w:val="0"/>
-                <w:shd w:fill="auto" w:val="clear"/>
               </w:rPr>
             </w:pPr>
             <w:r>
@@ -12212,6 +12120,43 @@
                 <w:shd w:fill="auto" w:val="clear"/>
               </w:rPr>
             </w:pPr>
+            <w:r>
+              <w:rPr>
+                <w:rFonts w:ascii="Calibri" w:hAnsi="Calibri" w:cs="Calibri" w:eastAsia="Calibri"/>
+                <w:color w:val="auto"/>
+                <w:spacing w:val="0"/>
+                <w:position w:val="0"/>
+                <w:sz w:val="22"/>
+                <w:shd w:fill="auto" w:val="clear"/>
+              </w:rPr>
+              <w:t xml:space="preserve">Age, Total working</w:t>
+            </w:r>
+          </w:p>
+          <w:p>
+            <w:pPr>
+              <w:spacing w:before="0" w:after="0" w:line="560"/>
+              <w:ind w:right="0" w:left="0" w:firstLine="0"/>
+              <w:jc w:val="left"/>
+              <w:rPr>
+                <w:rFonts w:ascii="Calibri" w:hAnsi="Calibri" w:cs="Calibri" w:eastAsia="Calibri"/>
+                <w:color w:val="auto"/>
+                <w:spacing w:val="0"/>
+                <w:position w:val="0"/>
+                <w:sz w:val="22"/>
+                <w:shd w:fill="auto" w:val="clear"/>
+              </w:rPr>
+            </w:pPr>
+            <w:r>
+              <w:rPr>
+                <w:rFonts w:ascii="Calibri" w:hAnsi="Calibri" w:cs="Calibri" w:eastAsia="Calibri"/>
+                <w:color w:val="auto"/>
+                <w:spacing w:val="0"/>
+                <w:position w:val="0"/>
+                <w:sz w:val="22"/>
+                <w:shd w:fill="auto" w:val="clear"/>
+              </w:rPr>
+              <w:t xml:space="preserve">hours, Days remaining</w:t>
+            </w:r>
           </w:p>
         </w:tc>
         <w:tc>
@@ -12244,6 +12189,17 @@
                 <w:shd w:fill="auto" w:val="clear"/>
               </w:rPr>
             </w:pPr>
+            <w:r>
+              <w:rPr>
+                <w:rFonts w:ascii="Calibri" w:hAnsi="Calibri" w:cs="Calibri" w:eastAsia="Calibri"/>
+                <w:color w:val="auto"/>
+                <w:spacing w:val="0"/>
+                <w:position w:val="0"/>
+                <w:sz w:val="22"/>
+                <w:shd w:fill="auto" w:val="clear"/>
+              </w:rPr>
+              <w:t xml:space="preserve">EMPLOYEE, TASK</w:t>
+            </w:r>
           </w:p>
         </w:tc>
         <w:tc>
@@ -12308,7 +12264,6 @@
               <w:rPr>
                 <w:spacing w:val="0"/>
                 <w:position w:val="0"/>
-                <w:shd w:fill="auto" w:val="clear"/>
               </w:rPr>
             </w:pPr>
             <w:r>
@@ -12355,6 +12310,17 @@
                 <w:shd w:fill="auto" w:val="clear"/>
               </w:rPr>
             </w:pPr>
+            <w:r>
+              <w:rPr>
+                <w:rFonts w:ascii="Calibri" w:hAnsi="Calibri" w:cs="Calibri" w:eastAsia="Calibri"/>
+                <w:color w:val="auto"/>
+                <w:spacing w:val="0"/>
+                <w:position w:val="0"/>
+                <w:sz w:val="22"/>
+                <w:shd w:fill="auto" w:val="clear"/>
+              </w:rPr>
+              <w:t xml:space="preserve">TaskCode, DepName</w:t>
+            </w:r>
           </w:p>
         </w:tc>
         <w:tc>
@@ -12387,6 +12353,17 @@
                 <w:shd w:fill="auto" w:val="clear"/>
               </w:rPr>
             </w:pPr>
+            <w:r>
+              <w:rPr>
+                <w:rFonts w:ascii="Calibri" w:hAnsi="Calibri" w:cs="Calibri" w:eastAsia="Calibri"/>
+                <w:color w:val="auto"/>
+                <w:spacing w:val="0"/>
+                <w:position w:val="0"/>
+                <w:sz w:val="22"/>
+                <w:shd w:fill="auto" w:val="clear"/>
+              </w:rPr>
+              <w:t xml:space="preserve">TASK. DEPENDANT</w:t>
+            </w:r>
           </w:p>
         </w:tc>
         <w:tc>
@@ -12516,7 +12493,6 @@
               <w:rPr>
                 <w:spacing w:val="0"/>
                 <w:position w:val="0"/>
-                <w:shd w:fill="auto" w:val="clear"/>
               </w:rPr>
             </w:pPr>
             <w:r>
@@ -12557,7 +12533,6 @@
               <w:rPr>
                 <w:spacing w:val="0"/>
                 <w:position w:val="0"/>
-                <w:shd w:fill="auto" w:val="clear"/>
               </w:rPr>
             </w:pPr>
             <w:r>
@@ -12598,7 +12573,6 @@
               <w:rPr>
                 <w:spacing w:val="0"/>
                 <w:position w:val="0"/>
-                <w:shd w:fill="auto" w:val="clear"/>
               </w:rPr>
             </w:pPr>
             <w:r>
@@ -12639,7 +12613,6 @@
               <w:rPr>
                 <w:spacing w:val="0"/>
                 <w:position w:val="0"/>
-                <w:shd w:fill="auto" w:val="clear"/>
               </w:rPr>
             </w:pPr>
             <w:r>
@@ -12680,7 +12653,6 @@
               <w:rPr>
                 <w:spacing w:val="0"/>
                 <w:position w:val="0"/>
-                <w:shd w:fill="auto" w:val="clear"/>
               </w:rPr>
             </w:pPr>
             <w:r>
@@ -12727,7 +12699,6 @@
               <w:rPr>
                 <w:spacing w:val="0"/>
                 <w:position w:val="0"/>
-                <w:shd w:fill="auto" w:val="clear"/>
               </w:rPr>
             </w:pPr>
             <w:r>
@@ -12774,6 +12745,17 @@
                 <w:shd w:fill="auto" w:val="clear"/>
               </w:rPr>
             </w:pPr>
+            <w:r>
+              <w:rPr>
+                <w:rFonts w:ascii="Calibri" w:hAnsi="Calibri" w:cs="Calibri" w:eastAsia="Calibri"/>
+                <w:color w:val="auto"/>
+                <w:spacing w:val="0"/>
+                <w:position w:val="0"/>
+                <w:sz w:val="22"/>
+                <w:shd w:fill="auto" w:val="clear"/>
+              </w:rPr>
+              <w:t xml:space="preserve">DEPARTMENT</w:t>
+            </w:r>
           </w:p>
         </w:tc>
         <w:tc>
@@ -12806,6 +12788,17 @@
                 <w:shd w:fill="auto" w:val="clear"/>
               </w:rPr>
             </w:pPr>
+            <w:r>
+              <w:rPr>
+                <w:rFonts w:ascii="Calibri" w:hAnsi="Calibri" w:cs="Calibri" w:eastAsia="Calibri"/>
+                <w:color w:val="auto"/>
+                <w:spacing w:val="0"/>
+                <w:position w:val="0"/>
+                <w:sz w:val="22"/>
+                <w:shd w:fill="auto" w:val="clear"/>
+              </w:rPr>
+              <w:t xml:space="preserve">Strong</w:t>
+            </w:r>
           </w:p>
         </w:tc>
         <w:tc>
@@ -12902,7 +12895,6 @@
               <w:rPr>
                 <w:spacing w:val="0"/>
                 <w:position w:val="0"/>
-                <w:shd w:fill="auto" w:val="clear"/>
               </w:rPr>
             </w:pPr>
             <w:r>
@@ -12949,6 +12941,17 @@
                 <w:shd w:fill="auto" w:val="clear"/>
               </w:rPr>
             </w:pPr>
+            <w:r>
+              <w:rPr>
+                <w:rFonts w:ascii="Calibri" w:hAnsi="Calibri" w:cs="Calibri" w:eastAsia="Calibri"/>
+                <w:color w:val="auto"/>
+                <w:spacing w:val="0"/>
+                <w:position w:val="0"/>
+                <w:sz w:val="22"/>
+                <w:shd w:fill="auto" w:val="clear"/>
+              </w:rPr>
+              <w:t xml:space="preserve">EMPLOYEE</w:t>
+            </w:r>
           </w:p>
         </w:tc>
         <w:tc>
@@ -12981,6 +12984,17 @@
                 <w:shd w:fill="auto" w:val="clear"/>
               </w:rPr>
             </w:pPr>
+            <w:r>
+              <w:rPr>
+                <w:rFonts w:ascii="Calibri" w:hAnsi="Calibri" w:cs="Calibri" w:eastAsia="Calibri"/>
+                <w:color w:val="auto"/>
+                <w:spacing w:val="0"/>
+                <w:position w:val="0"/>
+                <w:sz w:val="22"/>
+                <w:shd w:fill="auto" w:val="clear"/>
+              </w:rPr>
+              <w:t xml:space="preserve">Strong</w:t>
+            </w:r>
           </w:p>
         </w:tc>
         <w:tc>
@@ -13077,7 +13091,6 @@
               <w:rPr>
                 <w:spacing w:val="0"/>
                 <w:position w:val="0"/>
-                <w:shd w:fill="auto" w:val="clear"/>
               </w:rPr>
             </w:pPr>
             <w:r>
@@ -13124,6 +13137,17 @@
                 <w:shd w:fill="auto" w:val="clear"/>
               </w:rPr>
             </w:pPr>
+            <w:r>
+              <w:rPr>
+                <w:rFonts w:ascii="Calibri" w:hAnsi="Calibri" w:cs="Calibri" w:eastAsia="Calibri"/>
+                <w:color w:val="auto"/>
+                <w:spacing w:val="0"/>
+                <w:position w:val="0"/>
+                <w:sz w:val="22"/>
+                <w:shd w:fill="auto" w:val="clear"/>
+              </w:rPr>
+              <w:t xml:space="preserve">PROJECT</w:t>
+            </w:r>
           </w:p>
         </w:tc>
         <w:tc>
@@ -13156,6 +13180,17 @@
                 <w:shd w:fill="auto" w:val="clear"/>
               </w:rPr>
             </w:pPr>
+            <w:r>
+              <w:rPr>
+                <w:rFonts w:ascii="Calibri" w:hAnsi="Calibri" w:cs="Calibri" w:eastAsia="Calibri"/>
+                <w:color w:val="auto"/>
+                <w:spacing w:val="0"/>
+                <w:position w:val="0"/>
+                <w:sz w:val="22"/>
+                <w:shd w:fill="auto" w:val="clear"/>
+              </w:rPr>
+              <w:t xml:space="preserve">Strong</w:t>
+            </w:r>
           </w:p>
         </w:tc>
         <w:tc>
@@ -13252,7 +13287,6 @@
               <w:rPr>
                 <w:spacing w:val="0"/>
                 <w:position w:val="0"/>
-                <w:shd w:fill="auto" w:val="clear"/>
               </w:rPr>
             </w:pPr>
             <w:r>
@@ -13299,6 +13333,17 @@
                 <w:shd w:fill="auto" w:val="clear"/>
               </w:rPr>
             </w:pPr>
+            <w:r>
+              <w:rPr>
+                <w:rFonts w:ascii="Calibri" w:hAnsi="Calibri" w:cs="Calibri" w:eastAsia="Calibri"/>
+                <w:color w:val="auto"/>
+                <w:spacing w:val="0"/>
+                <w:position w:val="0"/>
+                <w:sz w:val="22"/>
+                <w:shd w:fill="auto" w:val="clear"/>
+              </w:rPr>
+              <w:t xml:space="preserve">TASK</w:t>
+            </w:r>
           </w:p>
         </w:tc>
         <w:tc>
@@ -13331,6 +13376,17 @@
                 <w:shd w:fill="auto" w:val="clear"/>
               </w:rPr>
             </w:pPr>
+            <w:r>
+              <w:rPr>
+                <w:rFonts w:ascii="Calibri" w:hAnsi="Calibri" w:cs="Calibri" w:eastAsia="Calibri"/>
+                <w:color w:val="auto"/>
+                <w:spacing w:val="0"/>
+                <w:position w:val="0"/>
+                <w:sz w:val="22"/>
+                <w:shd w:fill="auto" w:val="clear"/>
+              </w:rPr>
+              <w:t xml:space="preserve">Weak</w:t>
+            </w:r>
           </w:p>
         </w:tc>
         <w:tc>
@@ -13363,6 +13419,17 @@
                 <w:shd w:fill="auto" w:val="clear"/>
               </w:rPr>
             </w:pPr>
+            <w:r>
+              <w:rPr>
+                <w:rFonts w:ascii="Calibri" w:hAnsi="Calibri" w:cs="Calibri" w:eastAsia="Calibri"/>
+                <w:color w:val="auto"/>
+                <w:spacing w:val="0"/>
+                <w:position w:val="0"/>
+                <w:sz w:val="22"/>
+                <w:shd w:fill="auto" w:val="clear"/>
+              </w:rPr>
+              <w:t xml:space="preserve">PROJECT</w:t>
+            </w:r>
           </w:p>
         </w:tc>
         <w:tc>
@@ -13427,7 +13494,6 @@
               <w:rPr>
                 <w:spacing w:val="0"/>
                 <w:position w:val="0"/>
-                <w:shd w:fill="auto" w:val="clear"/>
               </w:rPr>
             </w:pPr>
             <w:r>
@@ -13474,6 +13540,17 @@
                 <w:shd w:fill="auto" w:val="clear"/>
               </w:rPr>
             </w:pPr>
+            <w:r>
+              <w:rPr>
+                <w:rFonts w:ascii="Calibri" w:hAnsi="Calibri" w:cs="Calibri" w:eastAsia="Calibri"/>
+                <w:color w:val="auto"/>
+                <w:spacing w:val="0"/>
+                <w:position w:val="0"/>
+                <w:sz w:val="22"/>
+                <w:shd w:fill="auto" w:val="clear"/>
+              </w:rPr>
+              <w:t xml:space="preserve">DEPENDANT</w:t>
+            </w:r>
           </w:p>
         </w:tc>
         <w:tc>
@@ -13506,6 +13583,17 @@
                 <w:shd w:fill="auto" w:val="clear"/>
               </w:rPr>
             </w:pPr>
+            <w:r>
+              <w:rPr>
+                <w:rFonts w:ascii="Calibri" w:hAnsi="Calibri" w:cs="Calibri" w:eastAsia="Calibri"/>
+                <w:color w:val="auto"/>
+                <w:spacing w:val="0"/>
+                <w:position w:val="0"/>
+                <w:sz w:val="22"/>
+                <w:shd w:fill="auto" w:val="clear"/>
+              </w:rPr>
+              <w:t xml:space="preserve">Weak</w:t>
+            </w:r>
           </w:p>
         </w:tc>
         <w:tc>
@@ -13538,6 +13626,17 @@
                 <w:shd w:fill="auto" w:val="clear"/>
               </w:rPr>
             </w:pPr>
+            <w:r>
+              <w:rPr>
+                <w:rFonts w:ascii="Calibri" w:hAnsi="Calibri" w:cs="Calibri" w:eastAsia="Calibri"/>
+                <w:color w:val="auto"/>
+                <w:spacing w:val="0"/>
+                <w:position w:val="0"/>
+                <w:sz w:val="22"/>
+                <w:shd w:fill="auto" w:val="clear"/>
+              </w:rPr>
+              <w:t xml:space="preserve">EMPLOYEE</w:t>
+            </w:r>
           </w:p>
         </w:tc>
         <w:tc>
@@ -13602,7 +13701,6 @@
               <w:rPr>
                 <w:spacing w:val="0"/>
                 <w:position w:val="0"/>
-                <w:shd w:fill="auto" w:val="clear"/>
               </w:rPr>
             </w:pPr>
             <w:r>
@@ -13777,7 +13875,6 @@
               <w:rPr>
                 <w:spacing w:val="0"/>
                 <w:position w:val="0"/>
-                <w:shd w:fill="auto" w:val="clear"/>
               </w:rPr>
             </w:pPr>
             <w:r>
@@ -13952,7 +14049,6 @@
               <w:rPr>
                 <w:spacing w:val="0"/>
                 <w:position w:val="0"/>
-                <w:shd w:fill="auto" w:val="clear"/>
               </w:rPr>
             </w:pPr>
             <w:r>
@@ -14208,7 +14304,6 @@
               <w:rPr>
                 <w:spacing w:val="0"/>
                 <w:position w:val="0"/>
-                <w:shd w:fill="auto" w:val="clear"/>
               </w:rPr>
             </w:pPr>
             <w:r>
@@ -14249,7 +14344,6 @@
               <w:rPr>
                 <w:spacing w:val="0"/>
                 <w:position w:val="0"/>
-                <w:shd w:fill="auto" w:val="clear"/>
               </w:rPr>
             </w:pPr>
             <w:r>
@@ -14290,7 +14384,6 @@
               <w:rPr>
                 <w:spacing w:val="0"/>
                 <w:position w:val="0"/>
-                <w:shd w:fill="auto" w:val="clear"/>
               </w:rPr>
             </w:pPr>
             <w:r>
@@ -14331,7 +14424,6 @@
               <w:rPr>
                 <w:spacing w:val="0"/>
                 <w:position w:val="0"/>
-                <w:shd w:fill="auto" w:val="clear"/>
               </w:rPr>
             </w:pPr>
             <w:r>
@@ -14372,7 +14464,6 @@
               <w:rPr>
                 <w:spacing w:val="0"/>
                 <w:position w:val="0"/>
-                <w:shd w:fill="auto" w:val="clear"/>
               </w:rPr>
             </w:pPr>
             <w:r>
@@ -14413,7 +14504,6 @@
               <w:rPr>
                 <w:spacing w:val="0"/>
                 <w:position w:val="0"/>
-                <w:shd w:fill="auto" w:val="clear"/>
               </w:rPr>
             </w:pPr>
             <w:r>
@@ -14428,6 +14518,271 @@
               </w:rPr>
               <w:t xml:space="preserve">Participation &amp; Notes</w:t>
             </w:r>
+          </w:p>
+        </w:tc>
+      </w:tr>
+      <w:tr>
+        <w:trPr>
+          <w:trHeight w:val="480" w:hRule="auto"/>
+          <w:jc w:val="left"/>
+        </w:trPr>
+        <w:tc>
+          <w:tcPr>
+            <w:tcW w:w="416" w:type="dxa"/>
+            <w:tcBorders>
+              <w:top w:val="single" w:color="cccccc" w:sz="6"/>
+              <w:left w:val="single" w:color="cccccc" w:sz="6"/>
+              <w:bottom w:val="single" w:color="cccccc" w:sz="6"/>
+              <w:right w:val="single" w:color="cccccc" w:sz="6"/>
+            </w:tcBorders>
+            <w:shd w:color="auto" w:fill="f5f5f5" w:val="clear"/>
+            <w:tcMar>
+              <w:left w:w="140" w:type="dxa"/>
+              <w:right w:w="140" w:type="dxa"/>
+            </w:tcMar>
+            <w:vAlign w:val="top"/>
+          </w:tcPr>
+          <w:p>
+            <w:pPr>
+              <w:spacing w:before="0" w:after="0" w:line="300"/>
+              <w:ind w:right="0" w:left="0" w:firstLine="0"/>
+              <w:jc w:val="left"/>
+              <w:rPr>
+                <w:spacing w:val="0"/>
+                <w:position w:val="0"/>
+              </w:rPr>
+            </w:pPr>
+            <w:r>
+              <w:rPr>
+                <w:rFonts w:ascii="Times New Roman" w:hAnsi="Times New Roman" w:cs="Times New Roman" w:eastAsia="Times New Roman"/>
+                <w:b/>
+                <w:color w:val="000000"/>
+                <w:spacing w:val="0"/>
+                <w:position w:val="0"/>
+                <w:sz w:val="24"/>
+                <w:shd w:fill="auto" w:val="clear"/>
+              </w:rPr>
+              <w:t xml:space="preserve">1</w:t>
+            </w:r>
+          </w:p>
+        </w:tc>
+        <w:tc>
+          <w:tcPr>
+            <w:tcW w:w="2074" w:type="dxa"/>
+            <w:tcBorders>
+              <w:top w:val="single" w:color="cccccc" w:sz="6"/>
+              <w:left w:val="single" w:color="cccccc" w:sz="6"/>
+              <w:bottom w:val="single" w:color="cccccc" w:sz="6"/>
+              <w:right w:val="single" w:color="cccccc" w:sz="6"/>
+            </w:tcBorders>
+            <w:shd w:color="auto" w:fill="f5f5f5" w:val="clear"/>
+            <w:tcMar>
+              <w:left w:w="140" w:type="dxa"/>
+              <w:right w:w="140" w:type="dxa"/>
+            </w:tcMar>
+            <w:vAlign w:val="top"/>
+          </w:tcPr>
+          <w:p>
+            <w:pPr>
+              <w:spacing w:before="0" w:after="0" w:line="520"/>
+              <w:ind w:right="0" w:left="0" w:firstLine="0"/>
+              <w:jc w:val="left"/>
+              <w:rPr>
+                <w:rFonts w:ascii="Calibri" w:hAnsi="Calibri" w:cs="Calibri" w:eastAsia="Calibri"/>
+                <w:color w:val="auto"/>
+                <w:spacing w:val="0"/>
+                <w:position w:val="0"/>
+                <w:sz w:val="22"/>
+                <w:shd w:fill="auto" w:val="clear"/>
+              </w:rPr>
+            </w:pPr>
+            <w:r>
+              <w:rPr>
+                <w:rFonts w:ascii="Calibri" w:hAnsi="Calibri" w:cs="Calibri" w:eastAsia="Calibri"/>
+                <w:color w:val="auto"/>
+                <w:spacing w:val="0"/>
+                <w:position w:val="0"/>
+                <w:sz w:val="22"/>
+                <w:shd w:fill="auto" w:val="clear"/>
+              </w:rPr>
+              <w:t xml:space="preserve">Led By</w:t>
+            </w:r>
+          </w:p>
+        </w:tc>
+        <w:tc>
+          <w:tcPr>
+            <w:tcW w:w="2084" w:type="dxa"/>
+            <w:tcBorders>
+              <w:top w:val="single" w:color="cccccc" w:sz="6"/>
+              <w:left w:val="single" w:color="cccccc" w:sz="6"/>
+              <w:bottom w:val="single" w:color="cccccc" w:sz="6"/>
+              <w:right w:val="single" w:color="cccccc" w:sz="6"/>
+            </w:tcBorders>
+            <w:shd w:color="auto" w:fill="f5f5f5" w:val="clear"/>
+            <w:tcMar>
+              <w:left w:w="140" w:type="dxa"/>
+              <w:right w:w="140" w:type="dxa"/>
+            </w:tcMar>
+            <w:vAlign w:val="top"/>
+          </w:tcPr>
+          <w:p>
+            <w:pPr>
+              <w:spacing w:before="0" w:after="0" w:line="520"/>
+              <w:ind w:right="0" w:left="0" w:firstLine="0"/>
+              <w:jc w:val="left"/>
+              <w:rPr>
+                <w:rFonts w:ascii="Calibri" w:hAnsi="Calibri" w:cs="Calibri" w:eastAsia="Calibri"/>
+                <w:color w:val="auto"/>
+                <w:spacing w:val="0"/>
+                <w:position w:val="0"/>
+                <w:sz w:val="22"/>
+                <w:shd w:fill="auto" w:val="clear"/>
+              </w:rPr>
+            </w:pPr>
+            <w:r>
+              <w:rPr>
+                <w:rFonts w:ascii="Calibri" w:hAnsi="Calibri" w:cs="Calibri" w:eastAsia="Calibri"/>
+                <w:color w:val="auto"/>
+                <w:spacing w:val="0"/>
+                <w:position w:val="0"/>
+                <w:sz w:val="22"/>
+                <w:shd w:fill="auto" w:val="clear"/>
+              </w:rPr>
+              <w:t xml:space="preserve">DEPARTMENT.</w:t>
+            </w:r>
+          </w:p>
+          <w:p>
+            <w:pPr>
+              <w:spacing w:before="0" w:after="0" w:line="520"/>
+              <w:ind w:right="0" w:left="0" w:firstLine="0"/>
+              <w:jc w:val="left"/>
+              <w:rPr>
+                <w:rFonts w:ascii="Calibri" w:hAnsi="Calibri" w:cs="Calibri" w:eastAsia="Calibri"/>
+                <w:color w:val="auto"/>
+                <w:spacing w:val="0"/>
+                <w:position w:val="0"/>
+                <w:sz w:val="22"/>
+                <w:shd w:fill="auto" w:val="clear"/>
+              </w:rPr>
+            </w:pPr>
+            <w:r>
+              <w:rPr>
+                <w:rFonts w:ascii="Calibri" w:hAnsi="Calibri" w:cs="Calibri" w:eastAsia="Calibri"/>
+                <w:color w:val="auto"/>
+                <w:spacing w:val="0"/>
+                <w:position w:val="0"/>
+                <w:sz w:val="22"/>
+                <w:shd w:fill="auto" w:val="clear"/>
+              </w:rPr>
+              <w:t xml:space="preserve">EMPLOYEE</w:t>
+            </w:r>
+          </w:p>
+        </w:tc>
+        <w:tc>
+          <w:tcPr>
+            <w:tcW w:w="960" w:type="dxa"/>
+            <w:tcBorders>
+              <w:top w:val="single" w:color="cccccc" w:sz="6"/>
+              <w:left w:val="single" w:color="cccccc" w:sz="6"/>
+              <w:bottom w:val="single" w:color="cccccc" w:sz="6"/>
+              <w:right w:val="single" w:color="cccccc" w:sz="6"/>
+            </w:tcBorders>
+            <w:shd w:color="auto" w:fill="f5f5f5" w:val="clear"/>
+            <w:tcMar>
+              <w:left w:w="140" w:type="dxa"/>
+              <w:right w:w="140" w:type="dxa"/>
+            </w:tcMar>
+            <w:vAlign w:val="top"/>
+          </w:tcPr>
+          <w:p>
+            <w:pPr>
+              <w:spacing w:before="0" w:after="0" w:line="520"/>
+              <w:ind w:right="0" w:left="0" w:firstLine="0"/>
+              <w:jc w:val="left"/>
+              <w:rPr>
+                <w:rFonts w:ascii="Calibri" w:hAnsi="Calibri" w:cs="Calibri" w:eastAsia="Calibri"/>
+                <w:color w:val="auto"/>
+                <w:spacing w:val="0"/>
+                <w:position w:val="0"/>
+                <w:sz w:val="22"/>
+                <w:shd w:fill="auto" w:val="clear"/>
+              </w:rPr>
+            </w:pPr>
+            <w:r>
+              <w:rPr>
+                <w:rFonts w:ascii="Calibri" w:hAnsi="Calibri" w:cs="Calibri" w:eastAsia="Calibri"/>
+                <w:color w:val="auto"/>
+                <w:spacing w:val="0"/>
+                <w:position w:val="0"/>
+                <w:sz w:val="22"/>
+                <w:shd w:fill="auto" w:val="clear"/>
+              </w:rPr>
+              <w:t xml:space="preserve">Binary</w:t>
+            </w:r>
+          </w:p>
+        </w:tc>
+        <w:tc>
+          <w:tcPr>
+            <w:tcW w:w="1427" w:type="dxa"/>
+            <w:tcBorders>
+              <w:top w:val="single" w:color="cccccc" w:sz="6"/>
+              <w:left w:val="single" w:color="cccccc" w:sz="6"/>
+              <w:bottom w:val="single" w:color="cccccc" w:sz="6"/>
+              <w:right w:val="single" w:color="cccccc" w:sz="6"/>
+            </w:tcBorders>
+            <w:shd w:color="auto" w:fill="f5f5f5" w:val="clear"/>
+            <w:tcMar>
+              <w:left w:w="140" w:type="dxa"/>
+              <w:right w:w="140" w:type="dxa"/>
+            </w:tcMar>
+            <w:vAlign w:val="top"/>
+          </w:tcPr>
+          <w:p>
+            <w:pPr>
+              <w:spacing w:before="0" w:after="0" w:line="520"/>
+              <w:ind w:right="0" w:left="0" w:firstLine="0"/>
+              <w:jc w:val="left"/>
+              <w:rPr>
+                <w:rFonts w:ascii="Calibri" w:hAnsi="Calibri" w:cs="Calibri" w:eastAsia="Calibri"/>
+                <w:color w:val="auto"/>
+                <w:spacing w:val="0"/>
+                <w:position w:val="0"/>
+                <w:sz w:val="22"/>
+                <w:shd w:fill="auto" w:val="clear"/>
+              </w:rPr>
+            </w:pPr>
+          </w:p>
+        </w:tc>
+        <w:tc>
+          <w:tcPr>
+            <w:tcW w:w="2785" w:type="dxa"/>
+            <w:tcBorders>
+              <w:top w:val="single" w:color="cccccc" w:sz="6"/>
+              <w:left w:val="single" w:color="cccccc" w:sz="6"/>
+              <w:bottom w:val="single" w:color="cccccc" w:sz="6"/>
+              <w:right w:val="single" w:color="cccccc" w:sz="6"/>
+            </w:tcBorders>
+            <w:shd w:color="auto" w:fill="f5f5f5" w:val="clear"/>
+            <w:tcMar>
+              <w:left w:w="140" w:type="dxa"/>
+              <w:right w:w="140" w:type="dxa"/>
+            </w:tcMar>
+            <w:vAlign w:val="top"/>
+          </w:tcPr>
+          <w:p>
+            <w:pPr>
+              <w:spacing w:before="0" w:after="0" w:line="520"/>
+              <w:ind w:right="0" w:left="0" w:firstLine="0"/>
+              <w:jc w:val="left"/>
+              <w:rPr>
+                <w:rFonts w:ascii="Calibri" w:hAnsi="Calibri" w:cs="Calibri" w:eastAsia="Calibri"/>
+                <w:color w:val="auto"/>
+                <w:spacing w:val="0"/>
+                <w:position w:val="0"/>
+                <w:sz w:val="22"/>
+                <w:shd w:fill="auto" w:val="clear"/>
+              </w:rPr>
+            </w:pPr>
           </w:p>
         </w:tc>
       </w:tr>
@@ -14445,7 +14800,7 @@
               <w:bottom w:val="single" w:color="cccccc" w:sz="6"/>
               <w:right w:val="single" w:color="cccccc" w:sz="6"/>
             </w:tcBorders>
-            <w:shd w:color="auto" w:fill="f5f5f5" w:val="clear"/>
+            <w:shd w:color="auto" w:fill="ffffff" w:val="clear"/>
             <w:tcMar>
               <w:left w:w="140" w:type="dxa"/>
               <w:right w:w="140" w:type="dxa"/>
@@ -14460,7 +14815,6 @@
               <w:rPr>
                 <w:spacing w:val="0"/>
                 <w:position w:val="0"/>
-                <w:shd w:fill="auto" w:val="clear"/>
               </w:rPr>
             </w:pPr>
             <w:r>
@@ -14473,7 +14827,7 @@
                 <w:sz w:val="24"/>
                 <w:shd w:fill="auto" w:val="clear"/>
               </w:rPr>
-              <w:t xml:space="preserve">1</w:t>
+              <w:t xml:space="preserve">2</w:t>
             </w:r>
           </w:p>
         </w:tc>
@@ -14486,27 +14840,38 @@
               <w:bottom w:val="single" w:color="cccccc" w:sz="6"/>
               <w:right w:val="single" w:color="cccccc" w:sz="6"/>
             </w:tcBorders>
-            <w:shd w:color="auto" w:fill="f5f5f5" w:val="clear"/>
-            <w:tcMar>
-              <w:left w:w="140" w:type="dxa"/>
-              <w:right w:w="140" w:type="dxa"/>
-            </w:tcMar>
-            <w:vAlign w:val="top"/>
-          </w:tcPr>
-          <w:p>
-            <w:pPr>
-              <w:spacing w:before="0" w:after="0" w:line="520"/>
-              <w:ind w:right="0" w:left="0" w:firstLine="0"/>
-              <w:jc w:val="left"/>
-              <w:rPr>
-                <w:rFonts w:ascii="Calibri" w:hAnsi="Calibri" w:cs="Calibri" w:eastAsia="Calibri"/>
-                <w:color w:val="auto"/>
-                <w:spacing w:val="0"/>
-                <w:position w:val="0"/>
-                <w:sz w:val="22"/>
-                <w:shd w:fill="auto" w:val="clear"/>
-              </w:rPr>
-            </w:pPr>
+            <w:shd w:color="auto" w:fill="ffffff" w:val="clear"/>
+            <w:tcMar>
+              <w:left w:w="140" w:type="dxa"/>
+              <w:right w:w="140" w:type="dxa"/>
+            </w:tcMar>
+            <w:vAlign w:val="top"/>
+          </w:tcPr>
+          <w:p>
+            <w:pPr>
+              <w:spacing w:before="0" w:after="0" w:line="520"/>
+              <w:ind w:right="0" w:left="0" w:firstLine="0"/>
+              <w:jc w:val="left"/>
+              <w:rPr>
+                <w:rFonts w:ascii="Calibri" w:hAnsi="Calibri" w:cs="Calibri" w:eastAsia="Calibri"/>
+                <w:color w:val="auto"/>
+                <w:spacing w:val="0"/>
+                <w:position w:val="0"/>
+                <w:sz w:val="22"/>
+                <w:shd w:fill="auto" w:val="clear"/>
+              </w:rPr>
+            </w:pPr>
+            <w:r>
+              <w:rPr>
+                <w:rFonts w:ascii="Calibri" w:hAnsi="Calibri" w:cs="Calibri" w:eastAsia="Calibri"/>
+                <w:color w:val="auto"/>
+                <w:spacing w:val="0"/>
+                <w:position w:val="0"/>
+                <w:sz w:val="22"/>
+                <w:shd w:fill="auto" w:val="clear"/>
+              </w:rPr>
+              <w:t xml:space="preserve">Belongs To</w:t>
+            </w:r>
           </w:p>
         </w:tc>
         <w:tc>
@@ -14518,27 +14883,64 @@
               <w:bottom w:val="single" w:color="cccccc" w:sz="6"/>
               <w:right w:val="single" w:color="cccccc" w:sz="6"/>
             </w:tcBorders>
-            <w:shd w:color="auto" w:fill="f5f5f5" w:val="clear"/>
-            <w:tcMar>
-              <w:left w:w="140" w:type="dxa"/>
-              <w:right w:w="140" w:type="dxa"/>
-            </w:tcMar>
-            <w:vAlign w:val="top"/>
-          </w:tcPr>
-          <w:p>
-            <w:pPr>
-              <w:spacing w:before="0" w:after="0" w:line="520"/>
-              <w:ind w:right="0" w:left="0" w:firstLine="0"/>
-              <w:jc w:val="left"/>
-              <w:rPr>
-                <w:rFonts w:ascii="Calibri" w:hAnsi="Calibri" w:cs="Calibri" w:eastAsia="Calibri"/>
-                <w:color w:val="auto"/>
-                <w:spacing w:val="0"/>
-                <w:position w:val="0"/>
-                <w:sz w:val="22"/>
-                <w:shd w:fill="auto" w:val="clear"/>
-              </w:rPr>
-            </w:pPr>
+            <w:shd w:color="auto" w:fill="ffffff" w:val="clear"/>
+            <w:tcMar>
+              <w:left w:w="140" w:type="dxa"/>
+              <w:right w:w="140" w:type="dxa"/>
+            </w:tcMar>
+            <w:vAlign w:val="top"/>
+          </w:tcPr>
+          <w:p>
+            <w:pPr>
+              <w:spacing w:before="0" w:after="0" w:line="520"/>
+              <w:ind w:right="0" w:left="0" w:firstLine="0"/>
+              <w:jc w:val="left"/>
+              <w:rPr>
+                <w:rFonts w:ascii="Calibri" w:hAnsi="Calibri" w:cs="Calibri" w:eastAsia="Calibri"/>
+                <w:color w:val="auto"/>
+                <w:spacing w:val="0"/>
+                <w:position w:val="0"/>
+                <w:sz w:val="22"/>
+                <w:shd w:fill="auto" w:val="clear"/>
+              </w:rPr>
+            </w:pPr>
+            <w:r>
+              <w:rPr>
+                <w:rFonts w:ascii="Calibri" w:hAnsi="Calibri" w:cs="Calibri" w:eastAsia="Calibri"/>
+                <w:color w:val="auto"/>
+                <w:spacing w:val="0"/>
+                <w:position w:val="0"/>
+                <w:sz w:val="22"/>
+                <w:shd w:fill="auto" w:val="clear"/>
+              </w:rPr>
+              <w:t xml:space="preserve">EMPLOYEE,</w:t>
+            </w:r>
+          </w:p>
+          <w:p>
+            <w:pPr>
+              <w:spacing w:before="0" w:after="0" w:line="520"/>
+              <w:ind w:right="0" w:left="0" w:firstLine="0"/>
+              <w:jc w:val="left"/>
+              <w:rPr>
+                <w:rFonts w:ascii="Calibri" w:hAnsi="Calibri" w:cs="Calibri" w:eastAsia="Calibri"/>
+                <w:color w:val="auto"/>
+                <w:spacing w:val="0"/>
+                <w:position w:val="0"/>
+                <w:sz w:val="22"/>
+                <w:shd w:fill="auto" w:val="clear"/>
+              </w:rPr>
+            </w:pPr>
+            <w:r>
+              <w:rPr>
+                <w:rFonts w:ascii="Calibri" w:hAnsi="Calibri" w:cs="Calibri" w:eastAsia="Calibri"/>
+                <w:color w:val="auto"/>
+                <w:spacing w:val="0"/>
+                <w:position w:val="0"/>
+                <w:sz w:val="22"/>
+                <w:shd w:fill="auto" w:val="clear"/>
+              </w:rPr>
+              <w:t xml:space="preserve">DEPARTMENT</w:t>
+            </w:r>
           </w:p>
         </w:tc>
         <w:tc>
@@ -14550,27 +14952,38 @@
               <w:bottom w:val="single" w:color="cccccc" w:sz="6"/>
               <w:right w:val="single" w:color="cccccc" w:sz="6"/>
             </w:tcBorders>
-            <w:shd w:color="auto" w:fill="f5f5f5" w:val="clear"/>
-            <w:tcMar>
-              <w:left w:w="140" w:type="dxa"/>
-              <w:right w:w="140" w:type="dxa"/>
-            </w:tcMar>
-            <w:vAlign w:val="top"/>
-          </w:tcPr>
-          <w:p>
-            <w:pPr>
-              <w:spacing w:before="0" w:after="0" w:line="520"/>
-              <w:ind w:right="0" w:left="0" w:firstLine="0"/>
-              <w:jc w:val="left"/>
-              <w:rPr>
-                <w:rFonts w:ascii="Calibri" w:hAnsi="Calibri" w:cs="Calibri" w:eastAsia="Calibri"/>
-                <w:color w:val="auto"/>
-                <w:spacing w:val="0"/>
-                <w:position w:val="0"/>
-                <w:sz w:val="22"/>
-                <w:shd w:fill="auto" w:val="clear"/>
-              </w:rPr>
-            </w:pPr>
+            <w:shd w:color="auto" w:fill="ffffff" w:val="clear"/>
+            <w:tcMar>
+              <w:left w:w="140" w:type="dxa"/>
+              <w:right w:w="140" w:type="dxa"/>
+            </w:tcMar>
+            <w:vAlign w:val="top"/>
+          </w:tcPr>
+          <w:p>
+            <w:pPr>
+              <w:spacing w:before="0" w:after="0" w:line="520"/>
+              <w:ind w:right="0" w:left="0" w:firstLine="0"/>
+              <w:jc w:val="left"/>
+              <w:rPr>
+                <w:rFonts w:ascii="Calibri" w:hAnsi="Calibri" w:cs="Calibri" w:eastAsia="Calibri"/>
+                <w:color w:val="auto"/>
+                <w:spacing w:val="0"/>
+                <w:position w:val="0"/>
+                <w:sz w:val="22"/>
+                <w:shd w:fill="auto" w:val="clear"/>
+              </w:rPr>
+            </w:pPr>
+            <w:r>
+              <w:rPr>
+                <w:rFonts w:ascii="Calibri" w:hAnsi="Calibri" w:cs="Calibri" w:eastAsia="Calibri"/>
+                <w:color w:val="auto"/>
+                <w:spacing w:val="0"/>
+                <w:position w:val="0"/>
+                <w:sz w:val="22"/>
+                <w:shd w:fill="auto" w:val="clear"/>
+              </w:rPr>
+              <w:t xml:space="preserve">Binary</w:t>
+            </w:r>
           </w:p>
         </w:tc>
         <w:tc>
@@ -14582,7 +14995,7 @@
               <w:bottom w:val="single" w:color="cccccc" w:sz="6"/>
               <w:right w:val="single" w:color="cccccc" w:sz="6"/>
             </w:tcBorders>
-            <w:shd w:color="auto" w:fill="f5f5f5" w:val="clear"/>
+            <w:shd w:color="auto" w:fill="ffffff" w:val="clear"/>
             <w:tcMar>
               <w:left w:w="140" w:type="dxa"/>
               <w:right w:w="140" w:type="dxa"/>
@@ -14614,7 +15027,7 @@
               <w:bottom w:val="single" w:color="cccccc" w:sz="6"/>
               <w:right w:val="single" w:color="cccccc" w:sz="6"/>
             </w:tcBorders>
-            <w:shd w:color="auto" w:fill="f5f5f5" w:val="clear"/>
+            <w:shd w:color="auto" w:fill="ffffff" w:val="clear"/>
             <w:tcMar>
               <w:left w:w="140" w:type="dxa"/>
               <w:right w:w="140" w:type="dxa"/>
@@ -14652,7 +15065,7 @@
               <w:bottom w:val="single" w:color="cccccc" w:sz="6"/>
               <w:right w:val="single" w:color="cccccc" w:sz="6"/>
             </w:tcBorders>
-            <w:shd w:color="auto" w:fill="ffffff" w:val="clear"/>
+            <w:shd w:color="auto" w:fill="f5f5f5" w:val="clear"/>
             <w:tcMar>
               <w:left w:w="140" w:type="dxa"/>
               <w:right w:w="140" w:type="dxa"/>
@@ -14667,7 +15080,6 @@
               <w:rPr>
                 <w:spacing w:val="0"/>
                 <w:position w:val="0"/>
-                <w:shd w:fill="auto" w:val="clear"/>
               </w:rPr>
             </w:pPr>
             <w:r>
@@ -14680,7 +15092,7 @@
                 <w:sz w:val="24"/>
                 <w:shd w:fill="auto" w:val="clear"/>
               </w:rPr>
-              <w:t xml:space="preserve">2</w:t>
+              <w:t xml:space="preserve">3</w:t>
             </w:r>
           </w:p>
         </w:tc>
@@ -14693,27 +15105,38 @@
               <w:bottom w:val="single" w:color="cccccc" w:sz="6"/>
               <w:right w:val="single" w:color="cccccc" w:sz="6"/>
             </w:tcBorders>
-            <w:shd w:color="auto" w:fill="ffffff" w:val="clear"/>
-            <w:tcMar>
-              <w:left w:w="140" w:type="dxa"/>
-              <w:right w:w="140" w:type="dxa"/>
-            </w:tcMar>
-            <w:vAlign w:val="top"/>
-          </w:tcPr>
-          <w:p>
-            <w:pPr>
-              <w:spacing w:before="0" w:after="0" w:line="520"/>
-              <w:ind w:right="0" w:left="0" w:firstLine="0"/>
-              <w:jc w:val="left"/>
-              <w:rPr>
-                <w:rFonts w:ascii="Calibri" w:hAnsi="Calibri" w:cs="Calibri" w:eastAsia="Calibri"/>
-                <w:color w:val="auto"/>
-                <w:spacing w:val="0"/>
-                <w:position w:val="0"/>
-                <w:sz w:val="22"/>
-                <w:shd w:fill="auto" w:val="clear"/>
-              </w:rPr>
-            </w:pPr>
+            <w:shd w:color="auto" w:fill="f5f5f5" w:val="clear"/>
+            <w:tcMar>
+              <w:left w:w="140" w:type="dxa"/>
+              <w:right w:w="140" w:type="dxa"/>
+            </w:tcMar>
+            <w:vAlign w:val="top"/>
+          </w:tcPr>
+          <w:p>
+            <w:pPr>
+              <w:spacing w:before="0" w:after="0" w:line="520"/>
+              <w:ind w:right="0" w:left="0" w:firstLine="0"/>
+              <w:jc w:val="left"/>
+              <w:rPr>
+                <w:rFonts w:ascii="Calibri" w:hAnsi="Calibri" w:cs="Calibri" w:eastAsia="Calibri"/>
+                <w:color w:val="auto"/>
+                <w:spacing w:val="0"/>
+                <w:position w:val="0"/>
+                <w:sz w:val="22"/>
+                <w:shd w:fill="auto" w:val="clear"/>
+              </w:rPr>
+            </w:pPr>
+            <w:r>
+              <w:rPr>
+                <w:rFonts w:ascii="Calibri" w:hAnsi="Calibri" w:cs="Calibri" w:eastAsia="Calibri"/>
+                <w:color w:val="auto"/>
+                <w:spacing w:val="0"/>
+                <w:position w:val="0"/>
+                <w:sz w:val="22"/>
+                <w:shd w:fill="auto" w:val="clear"/>
+              </w:rPr>
+              <w:t xml:space="preserve">Manages</w:t>
+            </w:r>
           </w:p>
         </w:tc>
         <w:tc>
@@ -14725,27 +15148,38 @@
               <w:bottom w:val="single" w:color="cccccc" w:sz="6"/>
               <w:right w:val="single" w:color="cccccc" w:sz="6"/>
             </w:tcBorders>
-            <w:shd w:color="auto" w:fill="ffffff" w:val="clear"/>
-            <w:tcMar>
-              <w:left w:w="140" w:type="dxa"/>
-              <w:right w:w="140" w:type="dxa"/>
-            </w:tcMar>
-            <w:vAlign w:val="top"/>
-          </w:tcPr>
-          <w:p>
-            <w:pPr>
-              <w:spacing w:before="0" w:after="0" w:line="520"/>
-              <w:ind w:right="0" w:left="0" w:firstLine="0"/>
-              <w:jc w:val="left"/>
-              <w:rPr>
-                <w:rFonts w:ascii="Calibri" w:hAnsi="Calibri" w:cs="Calibri" w:eastAsia="Calibri"/>
-                <w:color w:val="auto"/>
-                <w:spacing w:val="0"/>
-                <w:position w:val="0"/>
-                <w:sz w:val="22"/>
-                <w:shd w:fill="auto" w:val="clear"/>
-              </w:rPr>
-            </w:pPr>
+            <w:shd w:color="auto" w:fill="f5f5f5" w:val="clear"/>
+            <w:tcMar>
+              <w:left w:w="140" w:type="dxa"/>
+              <w:right w:w="140" w:type="dxa"/>
+            </w:tcMar>
+            <w:vAlign w:val="top"/>
+          </w:tcPr>
+          <w:p>
+            <w:pPr>
+              <w:spacing w:before="0" w:after="0" w:line="520"/>
+              <w:ind w:right="0" w:left="0" w:firstLine="0"/>
+              <w:jc w:val="left"/>
+              <w:rPr>
+                <w:rFonts w:ascii="Calibri" w:hAnsi="Calibri" w:cs="Calibri" w:eastAsia="Calibri"/>
+                <w:color w:val="auto"/>
+                <w:spacing w:val="0"/>
+                <w:position w:val="0"/>
+                <w:sz w:val="22"/>
+                <w:shd w:fill="auto" w:val="clear"/>
+              </w:rPr>
+            </w:pPr>
+            <w:r>
+              <w:rPr>
+                <w:rFonts w:ascii="Calibri" w:hAnsi="Calibri" w:cs="Calibri" w:eastAsia="Calibri"/>
+                <w:color w:val="auto"/>
+                <w:spacing w:val="0"/>
+                <w:position w:val="0"/>
+                <w:sz w:val="22"/>
+                <w:shd w:fill="auto" w:val="clear"/>
+              </w:rPr>
+              <w:t xml:space="preserve">EMPLOYEE, EMPLOYEE</w:t>
+            </w:r>
           </w:p>
         </w:tc>
         <w:tc>
@@ -14757,27 +15191,38 @@
               <w:bottom w:val="single" w:color="cccccc" w:sz="6"/>
               <w:right w:val="single" w:color="cccccc" w:sz="6"/>
             </w:tcBorders>
-            <w:shd w:color="auto" w:fill="ffffff" w:val="clear"/>
-            <w:tcMar>
-              <w:left w:w="140" w:type="dxa"/>
-              <w:right w:w="140" w:type="dxa"/>
-            </w:tcMar>
-            <w:vAlign w:val="top"/>
-          </w:tcPr>
-          <w:p>
-            <w:pPr>
-              <w:spacing w:before="0" w:after="0" w:line="520"/>
-              <w:ind w:right="0" w:left="0" w:firstLine="0"/>
-              <w:jc w:val="left"/>
-              <w:rPr>
-                <w:rFonts w:ascii="Calibri" w:hAnsi="Calibri" w:cs="Calibri" w:eastAsia="Calibri"/>
-                <w:color w:val="auto"/>
-                <w:spacing w:val="0"/>
-                <w:position w:val="0"/>
-                <w:sz w:val="22"/>
-                <w:shd w:fill="auto" w:val="clear"/>
-              </w:rPr>
-            </w:pPr>
+            <w:shd w:color="auto" w:fill="f5f5f5" w:val="clear"/>
+            <w:tcMar>
+              <w:left w:w="140" w:type="dxa"/>
+              <w:right w:w="140" w:type="dxa"/>
+            </w:tcMar>
+            <w:vAlign w:val="top"/>
+          </w:tcPr>
+          <w:p>
+            <w:pPr>
+              <w:spacing w:before="0" w:after="0" w:line="520"/>
+              <w:ind w:right="0" w:left="0" w:firstLine="0"/>
+              <w:jc w:val="left"/>
+              <w:rPr>
+                <w:rFonts w:ascii="Calibri" w:hAnsi="Calibri" w:cs="Calibri" w:eastAsia="Calibri"/>
+                <w:color w:val="auto"/>
+                <w:spacing w:val="0"/>
+                <w:position w:val="0"/>
+                <w:sz w:val="22"/>
+                <w:shd w:fill="auto" w:val="clear"/>
+              </w:rPr>
+            </w:pPr>
+            <w:r>
+              <w:rPr>
+                <w:rFonts w:ascii="Calibri" w:hAnsi="Calibri" w:cs="Calibri" w:eastAsia="Calibri"/>
+                <w:color w:val="auto"/>
+                <w:spacing w:val="0"/>
+                <w:position w:val="0"/>
+                <w:sz w:val="22"/>
+                <w:shd w:fill="auto" w:val="clear"/>
+              </w:rPr>
+              <w:t xml:space="preserve">Binary (Recursive)</w:t>
+            </w:r>
           </w:p>
         </w:tc>
         <w:tc>
@@ -14789,7 +15234,7 @@
               <w:bottom w:val="single" w:color="cccccc" w:sz="6"/>
               <w:right w:val="single" w:color="cccccc" w:sz="6"/>
             </w:tcBorders>
-            <w:shd w:color="auto" w:fill="ffffff" w:val="clear"/>
+            <w:shd w:color="auto" w:fill="f5f5f5" w:val="clear"/>
             <w:tcMar>
               <w:left w:w="140" w:type="dxa"/>
               <w:right w:w="140" w:type="dxa"/>
@@ -14821,7 +15266,7 @@
               <w:bottom w:val="single" w:color="cccccc" w:sz="6"/>
               <w:right w:val="single" w:color="cccccc" w:sz="6"/>
             </w:tcBorders>
-            <w:shd w:color="auto" w:fill="ffffff" w:val="clear"/>
+            <w:shd w:color="auto" w:fill="f5f5f5" w:val="clear"/>
             <w:tcMar>
               <w:left w:w="140" w:type="dxa"/>
               <w:right w:w="140" w:type="dxa"/>
@@ -14859,7 +15304,7 @@
               <w:bottom w:val="single" w:color="cccccc" w:sz="6"/>
               <w:right w:val="single" w:color="cccccc" w:sz="6"/>
             </w:tcBorders>
-            <w:shd w:color="auto" w:fill="f5f5f5" w:val="clear"/>
+            <w:shd w:color="auto" w:fill="ffffff" w:val="clear"/>
             <w:tcMar>
               <w:left w:w="140" w:type="dxa"/>
               <w:right w:w="140" w:type="dxa"/>
@@ -14874,7 +15319,6 @@
               <w:rPr>
                 <w:spacing w:val="0"/>
                 <w:position w:val="0"/>
-                <w:shd w:fill="auto" w:val="clear"/>
               </w:rPr>
             </w:pPr>
             <w:r>
@@ -14887,7 +15331,7 @@
                 <w:sz w:val="24"/>
                 <w:shd w:fill="auto" w:val="clear"/>
               </w:rPr>
-              <w:t xml:space="preserve">3</w:t>
+              <w:t xml:space="preserve">4</w:t>
             </w:r>
           </w:p>
         </w:tc>
@@ -14900,27 +15344,38 @@
               <w:bottom w:val="single" w:color="cccccc" w:sz="6"/>
               <w:right w:val="single" w:color="cccccc" w:sz="6"/>
             </w:tcBorders>
-            <w:shd w:color="auto" w:fill="f5f5f5" w:val="clear"/>
-            <w:tcMar>
-              <w:left w:w="140" w:type="dxa"/>
-              <w:right w:w="140" w:type="dxa"/>
-            </w:tcMar>
-            <w:vAlign w:val="top"/>
-          </w:tcPr>
-          <w:p>
-            <w:pPr>
-              <w:spacing w:before="0" w:after="0" w:line="520"/>
-              <w:ind w:right="0" w:left="0" w:firstLine="0"/>
-              <w:jc w:val="left"/>
-              <w:rPr>
-                <w:rFonts w:ascii="Calibri" w:hAnsi="Calibri" w:cs="Calibri" w:eastAsia="Calibri"/>
-                <w:color w:val="auto"/>
-                <w:spacing w:val="0"/>
-                <w:position w:val="0"/>
-                <w:sz w:val="22"/>
-                <w:shd w:fill="auto" w:val="clear"/>
-              </w:rPr>
-            </w:pPr>
+            <w:shd w:color="auto" w:fill="ffffff" w:val="clear"/>
+            <w:tcMar>
+              <w:left w:w="140" w:type="dxa"/>
+              <w:right w:w="140" w:type="dxa"/>
+            </w:tcMar>
+            <w:vAlign w:val="top"/>
+          </w:tcPr>
+          <w:p>
+            <w:pPr>
+              <w:spacing w:before="0" w:after="0" w:line="520"/>
+              <w:ind w:right="0" w:left="0" w:firstLine="0"/>
+              <w:jc w:val="left"/>
+              <w:rPr>
+                <w:rFonts w:ascii="Calibri" w:hAnsi="Calibri" w:cs="Calibri" w:eastAsia="Calibri"/>
+                <w:color w:val="auto"/>
+                <w:spacing w:val="0"/>
+                <w:position w:val="0"/>
+                <w:sz w:val="22"/>
+                <w:shd w:fill="auto" w:val="clear"/>
+              </w:rPr>
+            </w:pPr>
+            <w:r>
+              <w:rPr>
+                <w:rFonts w:ascii="Calibri" w:hAnsi="Calibri" w:cs="Calibri" w:eastAsia="Calibri"/>
+                <w:color w:val="auto"/>
+                <w:spacing w:val="0"/>
+                <w:position w:val="0"/>
+                <w:sz w:val="22"/>
+                <w:shd w:fill="auto" w:val="clear"/>
+              </w:rPr>
+              <w:t xml:space="preserve">Owns</w:t>
+            </w:r>
           </w:p>
         </w:tc>
         <w:tc>
@@ -14932,27 +15387,64 @@
               <w:bottom w:val="single" w:color="cccccc" w:sz="6"/>
               <w:right w:val="single" w:color="cccccc" w:sz="6"/>
             </w:tcBorders>
-            <w:shd w:color="auto" w:fill="f5f5f5" w:val="clear"/>
-            <w:tcMar>
-              <w:left w:w="140" w:type="dxa"/>
-              <w:right w:w="140" w:type="dxa"/>
-            </w:tcMar>
-            <w:vAlign w:val="top"/>
-          </w:tcPr>
-          <w:p>
-            <w:pPr>
-              <w:spacing w:before="0" w:after="0" w:line="520"/>
-              <w:ind w:right="0" w:left="0" w:firstLine="0"/>
-              <w:jc w:val="left"/>
-              <w:rPr>
-                <w:rFonts w:ascii="Calibri" w:hAnsi="Calibri" w:cs="Calibri" w:eastAsia="Calibri"/>
-                <w:color w:val="auto"/>
-                <w:spacing w:val="0"/>
-                <w:position w:val="0"/>
-                <w:sz w:val="22"/>
-                <w:shd w:fill="auto" w:val="clear"/>
-              </w:rPr>
-            </w:pPr>
+            <w:shd w:color="auto" w:fill="ffffff" w:val="clear"/>
+            <w:tcMar>
+              <w:left w:w="140" w:type="dxa"/>
+              <w:right w:w="140" w:type="dxa"/>
+            </w:tcMar>
+            <w:vAlign w:val="top"/>
+          </w:tcPr>
+          <w:p>
+            <w:pPr>
+              <w:spacing w:before="0" w:after="0" w:line="520"/>
+              <w:ind w:right="0" w:left="0" w:firstLine="0"/>
+              <w:jc w:val="left"/>
+              <w:rPr>
+                <w:rFonts w:ascii="Calibri" w:hAnsi="Calibri" w:cs="Calibri" w:eastAsia="Calibri"/>
+                <w:color w:val="auto"/>
+                <w:spacing w:val="0"/>
+                <w:position w:val="0"/>
+                <w:sz w:val="22"/>
+                <w:shd w:fill="auto" w:val="clear"/>
+              </w:rPr>
+            </w:pPr>
+            <w:r>
+              <w:rPr>
+                <w:rFonts w:ascii="Calibri" w:hAnsi="Calibri" w:cs="Calibri" w:eastAsia="Calibri"/>
+                <w:color w:val="auto"/>
+                <w:spacing w:val="0"/>
+                <w:position w:val="0"/>
+                <w:sz w:val="22"/>
+                <w:shd w:fill="auto" w:val="clear"/>
+              </w:rPr>
+              <w:t xml:space="preserve">DEPARTMENT,</w:t>
+            </w:r>
+          </w:p>
+          <w:p>
+            <w:pPr>
+              <w:spacing w:before="0" w:after="0" w:line="520"/>
+              <w:ind w:right="0" w:left="0" w:firstLine="0"/>
+              <w:jc w:val="left"/>
+              <w:rPr>
+                <w:rFonts w:ascii="Calibri" w:hAnsi="Calibri" w:cs="Calibri" w:eastAsia="Calibri"/>
+                <w:color w:val="auto"/>
+                <w:spacing w:val="0"/>
+                <w:position w:val="0"/>
+                <w:sz w:val="22"/>
+                <w:shd w:fill="auto" w:val="clear"/>
+              </w:rPr>
+            </w:pPr>
+            <w:r>
+              <w:rPr>
+                <w:rFonts w:ascii="Calibri" w:hAnsi="Calibri" w:cs="Calibri" w:eastAsia="Calibri"/>
+                <w:color w:val="auto"/>
+                <w:spacing w:val="0"/>
+                <w:position w:val="0"/>
+                <w:sz w:val="22"/>
+                <w:shd w:fill="auto" w:val="clear"/>
+              </w:rPr>
+              <w:t xml:space="preserve">PROJECT</w:t>
+            </w:r>
           </w:p>
         </w:tc>
         <w:tc>
@@ -14964,27 +15456,38 @@
               <w:bottom w:val="single" w:color="cccccc" w:sz="6"/>
               <w:right w:val="single" w:color="cccccc" w:sz="6"/>
             </w:tcBorders>
-            <w:shd w:color="auto" w:fill="f5f5f5" w:val="clear"/>
-            <w:tcMar>
-              <w:left w:w="140" w:type="dxa"/>
-              <w:right w:w="140" w:type="dxa"/>
-            </w:tcMar>
-            <w:vAlign w:val="top"/>
-          </w:tcPr>
-          <w:p>
-            <w:pPr>
-              <w:spacing w:before="0" w:after="0" w:line="520"/>
-              <w:ind w:right="0" w:left="0" w:firstLine="0"/>
-              <w:jc w:val="left"/>
-              <w:rPr>
-                <w:rFonts w:ascii="Calibri" w:hAnsi="Calibri" w:cs="Calibri" w:eastAsia="Calibri"/>
-                <w:color w:val="auto"/>
-                <w:spacing w:val="0"/>
-                <w:position w:val="0"/>
-                <w:sz w:val="22"/>
-                <w:shd w:fill="auto" w:val="clear"/>
-              </w:rPr>
-            </w:pPr>
+            <w:shd w:color="auto" w:fill="ffffff" w:val="clear"/>
+            <w:tcMar>
+              <w:left w:w="140" w:type="dxa"/>
+              <w:right w:w="140" w:type="dxa"/>
+            </w:tcMar>
+            <w:vAlign w:val="top"/>
+          </w:tcPr>
+          <w:p>
+            <w:pPr>
+              <w:spacing w:before="0" w:after="0" w:line="520"/>
+              <w:ind w:right="0" w:left="0" w:firstLine="0"/>
+              <w:jc w:val="left"/>
+              <w:rPr>
+                <w:rFonts w:ascii="Calibri" w:hAnsi="Calibri" w:cs="Calibri" w:eastAsia="Calibri"/>
+                <w:color w:val="auto"/>
+                <w:spacing w:val="0"/>
+                <w:position w:val="0"/>
+                <w:sz w:val="22"/>
+                <w:shd w:fill="auto" w:val="clear"/>
+              </w:rPr>
+            </w:pPr>
+            <w:r>
+              <w:rPr>
+                <w:rFonts w:ascii="Calibri" w:hAnsi="Calibri" w:cs="Calibri" w:eastAsia="Calibri"/>
+                <w:color w:val="auto"/>
+                <w:spacing w:val="0"/>
+                <w:position w:val="0"/>
+                <w:sz w:val="22"/>
+                <w:shd w:fill="auto" w:val="clear"/>
+              </w:rPr>
+              <w:t xml:space="preserve">Binary</w:t>
+            </w:r>
           </w:p>
         </w:tc>
         <w:tc>
@@ -14996,7 +15499,7 @@
               <w:bottom w:val="single" w:color="cccccc" w:sz="6"/>
               <w:right w:val="single" w:color="cccccc" w:sz="6"/>
             </w:tcBorders>
-            <w:shd w:color="auto" w:fill="f5f5f5" w:val="clear"/>
+            <w:shd w:color="auto" w:fill="ffffff" w:val="clear"/>
             <w:tcMar>
               <w:left w:w="140" w:type="dxa"/>
               <w:right w:w="140" w:type="dxa"/>
@@ -15028,7 +15531,7 @@
               <w:bottom w:val="single" w:color="cccccc" w:sz="6"/>
               <w:right w:val="single" w:color="cccccc" w:sz="6"/>
             </w:tcBorders>
-            <w:shd w:color="auto" w:fill="f5f5f5" w:val="clear"/>
+            <w:shd w:color="auto" w:fill="ffffff" w:val="clear"/>
             <w:tcMar>
               <w:left w:w="140" w:type="dxa"/>
               <w:right w:w="140" w:type="dxa"/>
@@ -15066,7 +15569,7 @@
               <w:bottom w:val="single" w:color="cccccc" w:sz="6"/>
               <w:right w:val="single" w:color="cccccc" w:sz="6"/>
             </w:tcBorders>
-            <w:shd w:color="auto" w:fill="ffffff" w:val="clear"/>
+            <w:shd w:color="auto" w:fill="f5f5f5" w:val="clear"/>
             <w:tcMar>
               <w:left w:w="140" w:type="dxa"/>
               <w:right w:w="140" w:type="dxa"/>
@@ -15081,7 +15584,6 @@
               <w:rPr>
                 <w:spacing w:val="0"/>
                 <w:position w:val="0"/>
-                <w:shd w:fill="auto" w:val="clear"/>
               </w:rPr>
             </w:pPr>
             <w:r>
@@ -15094,7 +15596,7 @@
                 <w:sz w:val="24"/>
                 <w:shd w:fill="auto" w:val="clear"/>
               </w:rPr>
-              <w:t xml:space="preserve">4</w:t>
+              <w:t xml:space="preserve">5</w:t>
             </w:r>
           </w:p>
         </w:tc>
@@ -15107,27 +15609,38 @@
               <w:bottom w:val="single" w:color="cccccc" w:sz="6"/>
               <w:right w:val="single" w:color="cccccc" w:sz="6"/>
             </w:tcBorders>
-            <w:shd w:color="auto" w:fill="ffffff" w:val="clear"/>
-            <w:tcMar>
-              <w:left w:w="140" w:type="dxa"/>
-              <w:right w:w="140" w:type="dxa"/>
-            </w:tcMar>
-            <w:vAlign w:val="top"/>
-          </w:tcPr>
-          <w:p>
-            <w:pPr>
-              <w:spacing w:before="0" w:after="0" w:line="520"/>
-              <w:ind w:right="0" w:left="0" w:firstLine="0"/>
-              <w:jc w:val="left"/>
-              <w:rPr>
-                <w:rFonts w:ascii="Calibri" w:hAnsi="Calibri" w:cs="Calibri" w:eastAsia="Calibri"/>
-                <w:color w:val="auto"/>
-                <w:spacing w:val="0"/>
-                <w:position w:val="0"/>
-                <w:sz w:val="22"/>
-                <w:shd w:fill="auto" w:val="clear"/>
-              </w:rPr>
-            </w:pPr>
+            <w:shd w:color="auto" w:fill="f5f5f5" w:val="clear"/>
+            <w:tcMar>
+              <w:left w:w="140" w:type="dxa"/>
+              <w:right w:w="140" w:type="dxa"/>
+            </w:tcMar>
+            <w:vAlign w:val="top"/>
+          </w:tcPr>
+          <w:p>
+            <w:pPr>
+              <w:spacing w:before="0" w:after="0" w:line="520"/>
+              <w:ind w:right="0" w:left="0" w:firstLine="0"/>
+              <w:jc w:val="left"/>
+              <w:rPr>
+                <w:rFonts w:ascii="Calibri" w:hAnsi="Calibri" w:cs="Calibri" w:eastAsia="Calibri"/>
+                <w:color w:val="auto"/>
+                <w:spacing w:val="0"/>
+                <w:position w:val="0"/>
+                <w:sz w:val="22"/>
+                <w:shd w:fill="auto" w:val="clear"/>
+              </w:rPr>
+            </w:pPr>
+            <w:r>
+              <w:rPr>
+                <w:rFonts w:ascii="Calibri" w:hAnsi="Calibri" w:cs="Calibri" w:eastAsia="Calibri"/>
+                <w:color w:val="auto"/>
+                <w:spacing w:val="0"/>
+                <w:position w:val="0"/>
+                <w:sz w:val="22"/>
+                <w:shd w:fill="auto" w:val="clear"/>
+              </w:rPr>
+              <w:t xml:space="preserve">Assigned To</w:t>
+            </w:r>
           </w:p>
         </w:tc>
         <w:tc>
@@ -15139,27 +15652,38 @@
               <w:bottom w:val="single" w:color="cccccc" w:sz="6"/>
               <w:right w:val="single" w:color="cccccc" w:sz="6"/>
             </w:tcBorders>
-            <w:shd w:color="auto" w:fill="ffffff" w:val="clear"/>
-            <w:tcMar>
-              <w:left w:w="140" w:type="dxa"/>
-              <w:right w:w="140" w:type="dxa"/>
-            </w:tcMar>
-            <w:vAlign w:val="top"/>
-          </w:tcPr>
-          <w:p>
-            <w:pPr>
-              <w:spacing w:before="0" w:after="0" w:line="520"/>
-              <w:ind w:right="0" w:left="0" w:firstLine="0"/>
-              <w:jc w:val="left"/>
-              <w:rPr>
-                <w:rFonts w:ascii="Calibri" w:hAnsi="Calibri" w:cs="Calibri" w:eastAsia="Calibri"/>
-                <w:color w:val="auto"/>
-                <w:spacing w:val="0"/>
-                <w:position w:val="0"/>
-                <w:sz w:val="22"/>
-                <w:shd w:fill="auto" w:val="clear"/>
-              </w:rPr>
-            </w:pPr>
+            <w:shd w:color="auto" w:fill="f5f5f5" w:val="clear"/>
+            <w:tcMar>
+              <w:left w:w="140" w:type="dxa"/>
+              <w:right w:w="140" w:type="dxa"/>
+            </w:tcMar>
+            <w:vAlign w:val="top"/>
+          </w:tcPr>
+          <w:p>
+            <w:pPr>
+              <w:spacing w:before="0" w:after="0" w:line="520"/>
+              <w:ind w:right="0" w:left="0" w:firstLine="0"/>
+              <w:jc w:val="left"/>
+              <w:rPr>
+                <w:rFonts w:ascii="Calibri" w:hAnsi="Calibri" w:cs="Calibri" w:eastAsia="Calibri"/>
+                <w:color w:val="auto"/>
+                <w:spacing w:val="0"/>
+                <w:position w:val="0"/>
+                <w:sz w:val="22"/>
+                <w:shd w:fill="auto" w:val="clear"/>
+              </w:rPr>
+            </w:pPr>
+            <w:r>
+              <w:rPr>
+                <w:rFonts w:ascii="Calibri" w:hAnsi="Calibri" w:cs="Calibri" w:eastAsia="Calibri"/>
+                <w:color w:val="auto"/>
+                <w:spacing w:val="0"/>
+                <w:position w:val="0"/>
+                <w:sz w:val="22"/>
+                <w:shd w:fill="auto" w:val="clear"/>
+              </w:rPr>
+              <w:t xml:space="preserve">EMPLOYEE, PROJECT</w:t>
+            </w:r>
           </w:p>
         </w:tc>
         <w:tc>
@@ -15171,27 +15695,38 @@
               <w:bottom w:val="single" w:color="cccccc" w:sz="6"/>
               <w:right w:val="single" w:color="cccccc" w:sz="6"/>
             </w:tcBorders>
-            <w:shd w:color="auto" w:fill="ffffff" w:val="clear"/>
-            <w:tcMar>
-              <w:left w:w="140" w:type="dxa"/>
-              <w:right w:w="140" w:type="dxa"/>
-            </w:tcMar>
-            <w:vAlign w:val="top"/>
-          </w:tcPr>
-          <w:p>
-            <w:pPr>
-              <w:spacing w:before="0" w:after="0" w:line="520"/>
-              <w:ind w:right="0" w:left="0" w:firstLine="0"/>
-              <w:jc w:val="left"/>
-              <w:rPr>
-                <w:rFonts w:ascii="Calibri" w:hAnsi="Calibri" w:cs="Calibri" w:eastAsia="Calibri"/>
-                <w:color w:val="auto"/>
-                <w:spacing w:val="0"/>
-                <w:position w:val="0"/>
-                <w:sz w:val="22"/>
-                <w:shd w:fill="auto" w:val="clear"/>
-              </w:rPr>
-            </w:pPr>
+            <w:shd w:color="auto" w:fill="f5f5f5" w:val="clear"/>
+            <w:tcMar>
+              <w:left w:w="140" w:type="dxa"/>
+              <w:right w:w="140" w:type="dxa"/>
+            </w:tcMar>
+            <w:vAlign w:val="top"/>
+          </w:tcPr>
+          <w:p>
+            <w:pPr>
+              <w:spacing w:before="0" w:after="0" w:line="520"/>
+              <w:ind w:right="0" w:left="0" w:firstLine="0"/>
+              <w:jc w:val="left"/>
+              <w:rPr>
+                <w:rFonts w:ascii="Calibri" w:hAnsi="Calibri" w:cs="Calibri" w:eastAsia="Calibri"/>
+                <w:color w:val="auto"/>
+                <w:spacing w:val="0"/>
+                <w:position w:val="0"/>
+                <w:sz w:val="22"/>
+                <w:shd w:fill="auto" w:val="clear"/>
+              </w:rPr>
+            </w:pPr>
+            <w:r>
+              <w:rPr>
+                <w:rFonts w:ascii="Calibri" w:hAnsi="Calibri" w:cs="Calibri" w:eastAsia="Calibri"/>
+                <w:color w:val="auto"/>
+                <w:spacing w:val="0"/>
+                <w:position w:val="0"/>
+                <w:sz w:val="22"/>
+                <w:shd w:fill="auto" w:val="clear"/>
+              </w:rPr>
+              <w:t xml:space="preserve">Binary</w:t>
+            </w:r>
           </w:p>
         </w:tc>
         <w:tc>
@@ -15203,7 +15738,7 @@
               <w:bottom w:val="single" w:color="cccccc" w:sz="6"/>
               <w:right w:val="single" w:color="cccccc" w:sz="6"/>
             </w:tcBorders>
-            <w:shd w:color="auto" w:fill="ffffff" w:val="clear"/>
+            <w:shd w:color="auto" w:fill="f5f5f5" w:val="clear"/>
             <w:tcMar>
               <w:left w:w="140" w:type="dxa"/>
               <w:right w:w="140" w:type="dxa"/>
@@ -15235,7 +15770,7 @@
               <w:bottom w:val="single" w:color="cccccc" w:sz="6"/>
               <w:right w:val="single" w:color="cccccc" w:sz="6"/>
             </w:tcBorders>
-            <w:shd w:color="auto" w:fill="ffffff" w:val="clear"/>
+            <w:shd w:color="auto" w:fill="f5f5f5" w:val="clear"/>
             <w:tcMar>
               <w:left w:w="140" w:type="dxa"/>
               <w:right w:w="140" w:type="dxa"/>
@@ -15273,7 +15808,7 @@
               <w:bottom w:val="single" w:color="cccccc" w:sz="6"/>
               <w:right w:val="single" w:color="cccccc" w:sz="6"/>
             </w:tcBorders>
-            <w:shd w:color="auto" w:fill="f5f5f5" w:val="clear"/>
+            <w:shd w:color="auto" w:fill="ffffff" w:val="clear"/>
             <w:tcMar>
               <w:left w:w="140" w:type="dxa"/>
               <w:right w:w="140" w:type="dxa"/>
@@ -15288,7 +15823,6 @@
               <w:rPr>
                 <w:spacing w:val="0"/>
                 <w:position w:val="0"/>
-                <w:shd w:fill="auto" w:val="clear"/>
               </w:rPr>
             </w:pPr>
             <w:r>
@@ -15301,7 +15835,7 @@
                 <w:sz w:val="24"/>
                 <w:shd w:fill="auto" w:val="clear"/>
               </w:rPr>
-              <w:t xml:space="preserve">5</w:t>
+              <w:t xml:space="preserve">6</w:t>
             </w:r>
           </w:p>
         </w:tc>
@@ -15314,27 +15848,38 @@
               <w:bottom w:val="single" w:color="cccccc" w:sz="6"/>
               <w:right w:val="single" w:color="cccccc" w:sz="6"/>
             </w:tcBorders>
-            <w:shd w:color="auto" w:fill="f5f5f5" w:val="clear"/>
-            <w:tcMar>
-              <w:left w:w="140" w:type="dxa"/>
-              <w:right w:w="140" w:type="dxa"/>
-            </w:tcMar>
-            <w:vAlign w:val="top"/>
-          </w:tcPr>
-          <w:p>
-            <w:pPr>
-              <w:spacing w:before="0" w:after="0" w:line="520"/>
-              <w:ind w:right="0" w:left="0" w:firstLine="0"/>
-              <w:jc w:val="left"/>
-              <w:rPr>
-                <w:rFonts w:ascii="Calibri" w:hAnsi="Calibri" w:cs="Calibri" w:eastAsia="Calibri"/>
-                <w:color w:val="auto"/>
-                <w:spacing w:val="0"/>
-                <w:position w:val="0"/>
-                <w:sz w:val="22"/>
-                <w:shd w:fill="auto" w:val="clear"/>
-              </w:rPr>
-            </w:pPr>
+            <w:shd w:color="auto" w:fill="ffffff" w:val="clear"/>
+            <w:tcMar>
+              <w:left w:w="140" w:type="dxa"/>
+              <w:right w:w="140" w:type="dxa"/>
+            </w:tcMar>
+            <w:vAlign w:val="top"/>
+          </w:tcPr>
+          <w:p>
+            <w:pPr>
+              <w:spacing w:before="0" w:after="0" w:line="520"/>
+              <w:ind w:right="0" w:left="0" w:firstLine="0"/>
+              <w:jc w:val="left"/>
+              <w:rPr>
+                <w:rFonts w:ascii="Calibri" w:hAnsi="Calibri" w:cs="Calibri" w:eastAsia="Calibri"/>
+                <w:color w:val="auto"/>
+                <w:spacing w:val="0"/>
+                <w:position w:val="0"/>
+                <w:sz w:val="22"/>
+                <w:shd w:fill="auto" w:val="clear"/>
+              </w:rPr>
+            </w:pPr>
+            <w:r>
+              <w:rPr>
+                <w:rFonts w:ascii="Calibri" w:hAnsi="Calibri" w:cs="Calibri" w:eastAsia="Calibri"/>
+                <w:color w:val="auto"/>
+                <w:spacing w:val="0"/>
+                <w:position w:val="0"/>
+                <w:sz w:val="22"/>
+                <w:shd w:fill="auto" w:val="clear"/>
+              </w:rPr>
+              <w:t xml:space="preserve">Broken Down Into</w:t>
+            </w:r>
           </w:p>
         </w:tc>
         <w:tc>
@@ -15346,27 +15891,38 @@
               <w:bottom w:val="single" w:color="cccccc" w:sz="6"/>
               <w:right w:val="single" w:color="cccccc" w:sz="6"/>
             </w:tcBorders>
-            <w:shd w:color="auto" w:fill="f5f5f5" w:val="clear"/>
-            <w:tcMar>
-              <w:left w:w="140" w:type="dxa"/>
-              <w:right w:w="140" w:type="dxa"/>
-            </w:tcMar>
-            <w:vAlign w:val="top"/>
-          </w:tcPr>
-          <w:p>
-            <w:pPr>
-              <w:spacing w:before="0" w:after="0" w:line="520"/>
-              <w:ind w:right="0" w:left="0" w:firstLine="0"/>
-              <w:jc w:val="left"/>
-              <w:rPr>
-                <w:rFonts w:ascii="Calibri" w:hAnsi="Calibri" w:cs="Calibri" w:eastAsia="Calibri"/>
-                <w:color w:val="auto"/>
-                <w:spacing w:val="0"/>
-                <w:position w:val="0"/>
-                <w:sz w:val="22"/>
-                <w:shd w:fill="auto" w:val="clear"/>
-              </w:rPr>
-            </w:pPr>
+            <w:shd w:color="auto" w:fill="ffffff" w:val="clear"/>
+            <w:tcMar>
+              <w:left w:w="140" w:type="dxa"/>
+              <w:right w:w="140" w:type="dxa"/>
+            </w:tcMar>
+            <w:vAlign w:val="top"/>
+          </w:tcPr>
+          <w:p>
+            <w:pPr>
+              <w:spacing w:before="0" w:after="0" w:line="520"/>
+              <w:ind w:right="0" w:left="0" w:firstLine="0"/>
+              <w:jc w:val="left"/>
+              <w:rPr>
+                <w:rFonts w:ascii="Calibri" w:hAnsi="Calibri" w:cs="Calibri" w:eastAsia="Calibri"/>
+                <w:color w:val="auto"/>
+                <w:spacing w:val="0"/>
+                <w:position w:val="0"/>
+                <w:sz w:val="22"/>
+                <w:shd w:fill="auto" w:val="clear"/>
+              </w:rPr>
+            </w:pPr>
+            <w:r>
+              <w:rPr>
+                <w:rFonts w:ascii="Calibri" w:hAnsi="Calibri" w:cs="Calibri" w:eastAsia="Calibri"/>
+                <w:color w:val="auto"/>
+                <w:spacing w:val="0"/>
+                <w:position w:val="0"/>
+                <w:sz w:val="22"/>
+                <w:shd w:fill="auto" w:val="clear"/>
+              </w:rPr>
+              <w:t xml:space="preserve">PROJECT, TASK</w:t>
+            </w:r>
           </w:p>
         </w:tc>
         <w:tc>
@@ -15378,27 +15934,38 @@
               <w:bottom w:val="single" w:color="cccccc" w:sz="6"/>
               <w:right w:val="single" w:color="cccccc" w:sz="6"/>
             </w:tcBorders>
-            <w:shd w:color="auto" w:fill="f5f5f5" w:val="clear"/>
-            <w:tcMar>
-              <w:left w:w="140" w:type="dxa"/>
-              <w:right w:w="140" w:type="dxa"/>
-            </w:tcMar>
-            <w:vAlign w:val="top"/>
-          </w:tcPr>
-          <w:p>
-            <w:pPr>
-              <w:spacing w:before="0" w:after="0" w:line="520"/>
-              <w:ind w:right="0" w:left="0" w:firstLine="0"/>
-              <w:jc w:val="left"/>
-              <w:rPr>
-                <w:rFonts w:ascii="Calibri" w:hAnsi="Calibri" w:cs="Calibri" w:eastAsia="Calibri"/>
-                <w:color w:val="auto"/>
-                <w:spacing w:val="0"/>
-                <w:position w:val="0"/>
-                <w:sz w:val="22"/>
-                <w:shd w:fill="auto" w:val="clear"/>
-              </w:rPr>
-            </w:pPr>
+            <w:shd w:color="auto" w:fill="ffffff" w:val="clear"/>
+            <w:tcMar>
+              <w:left w:w="140" w:type="dxa"/>
+              <w:right w:w="140" w:type="dxa"/>
+            </w:tcMar>
+            <w:vAlign w:val="top"/>
+          </w:tcPr>
+          <w:p>
+            <w:pPr>
+              <w:spacing w:before="0" w:after="0" w:line="520"/>
+              <w:ind w:right="0" w:left="0" w:firstLine="0"/>
+              <w:jc w:val="left"/>
+              <w:rPr>
+                <w:rFonts w:ascii="Calibri" w:hAnsi="Calibri" w:cs="Calibri" w:eastAsia="Calibri"/>
+                <w:color w:val="auto"/>
+                <w:spacing w:val="0"/>
+                <w:position w:val="0"/>
+                <w:sz w:val="22"/>
+                <w:shd w:fill="auto" w:val="clear"/>
+              </w:rPr>
+            </w:pPr>
+            <w:r>
+              <w:rPr>
+                <w:rFonts w:ascii="Calibri" w:hAnsi="Calibri" w:cs="Calibri" w:eastAsia="Calibri"/>
+                <w:color w:val="auto"/>
+                <w:spacing w:val="0"/>
+                <w:position w:val="0"/>
+                <w:sz w:val="22"/>
+                <w:shd w:fill="auto" w:val="clear"/>
+              </w:rPr>
+              <w:t xml:space="preserve">Binary</w:t>
+            </w:r>
           </w:p>
         </w:tc>
         <w:tc>
@@ -15410,7 +15977,7 @@
               <w:bottom w:val="single" w:color="cccccc" w:sz="6"/>
               <w:right w:val="single" w:color="cccccc" w:sz="6"/>
             </w:tcBorders>
-            <w:shd w:color="auto" w:fill="f5f5f5" w:val="clear"/>
+            <w:shd w:color="auto" w:fill="ffffff" w:val="clear"/>
             <w:tcMar>
               <w:left w:w="140" w:type="dxa"/>
               <w:right w:w="140" w:type="dxa"/>
@@ -15442,7 +16009,7 @@
               <w:bottom w:val="single" w:color="cccccc" w:sz="6"/>
               <w:right w:val="single" w:color="cccccc" w:sz="6"/>
             </w:tcBorders>
-            <w:shd w:color="auto" w:fill="f5f5f5" w:val="clear"/>
+            <w:shd w:color="auto" w:fill="ffffff" w:val="clear"/>
             <w:tcMar>
               <w:left w:w="140" w:type="dxa"/>
               <w:right w:w="140" w:type="dxa"/>
@@ -15480,7 +16047,7 @@
               <w:bottom w:val="single" w:color="cccccc" w:sz="6"/>
               <w:right w:val="single" w:color="cccccc" w:sz="6"/>
             </w:tcBorders>
-            <w:shd w:color="auto" w:fill="ffffff" w:val="clear"/>
+            <w:shd w:color="auto" w:fill="f5f5f5" w:val="clear"/>
             <w:tcMar>
               <w:left w:w="140" w:type="dxa"/>
               <w:right w:w="140" w:type="dxa"/>
@@ -15495,7 +16062,6 @@
               <w:rPr>
                 <w:spacing w:val="0"/>
                 <w:position w:val="0"/>
-                <w:shd w:fill="auto" w:val="clear"/>
               </w:rPr>
             </w:pPr>
             <w:r>
@@ -15508,7 +16074,7 @@
                 <w:sz w:val="24"/>
                 <w:shd w:fill="auto" w:val="clear"/>
               </w:rPr>
-              <w:t xml:space="preserve">6</w:t>
+              <w:t xml:space="preserve">7</w:t>
             </w:r>
           </w:p>
         </w:tc>
@@ -15521,27 +16087,38 @@
               <w:bottom w:val="single" w:color="cccccc" w:sz="6"/>
               <w:right w:val="single" w:color="cccccc" w:sz="6"/>
             </w:tcBorders>
-            <w:shd w:color="auto" w:fill="ffffff" w:val="clear"/>
-            <w:tcMar>
-              <w:left w:w="140" w:type="dxa"/>
-              <w:right w:w="140" w:type="dxa"/>
-            </w:tcMar>
-            <w:vAlign w:val="top"/>
-          </w:tcPr>
-          <w:p>
-            <w:pPr>
-              <w:spacing w:before="0" w:after="0" w:line="520"/>
-              <w:ind w:right="0" w:left="0" w:firstLine="0"/>
-              <w:jc w:val="left"/>
-              <w:rPr>
-                <w:rFonts w:ascii="Calibri" w:hAnsi="Calibri" w:cs="Calibri" w:eastAsia="Calibri"/>
-                <w:color w:val="auto"/>
-                <w:spacing w:val="0"/>
-                <w:position w:val="0"/>
-                <w:sz w:val="22"/>
-                <w:shd w:fill="auto" w:val="clear"/>
-              </w:rPr>
-            </w:pPr>
+            <w:shd w:color="auto" w:fill="f5f5f5" w:val="clear"/>
+            <w:tcMar>
+              <w:left w:w="140" w:type="dxa"/>
+              <w:right w:w="140" w:type="dxa"/>
+            </w:tcMar>
+            <w:vAlign w:val="top"/>
+          </w:tcPr>
+          <w:p>
+            <w:pPr>
+              <w:spacing w:before="0" w:after="0" w:line="520"/>
+              <w:ind w:right="0" w:left="0" w:firstLine="0"/>
+              <w:jc w:val="left"/>
+              <w:rPr>
+                <w:rFonts w:ascii="Calibri" w:hAnsi="Calibri" w:cs="Calibri" w:eastAsia="Calibri"/>
+                <w:color w:val="auto"/>
+                <w:spacing w:val="0"/>
+                <w:position w:val="0"/>
+                <w:sz w:val="22"/>
+                <w:shd w:fill="auto" w:val="clear"/>
+              </w:rPr>
+            </w:pPr>
+            <w:r>
+              <w:rPr>
+                <w:rFonts w:ascii="Calibri" w:hAnsi="Calibri" w:cs="Calibri" w:eastAsia="Calibri"/>
+                <w:color w:val="auto"/>
+                <w:spacing w:val="0"/>
+                <w:position w:val="0"/>
+                <w:sz w:val="22"/>
+                <w:shd w:fill="auto" w:val="clear"/>
+              </w:rPr>
+              <w:t xml:space="preserve">Has</w:t>
+            </w:r>
           </w:p>
         </w:tc>
         <w:tc>
@@ -15553,27 +16130,64 @@
               <w:bottom w:val="single" w:color="cccccc" w:sz="6"/>
               <w:right w:val="single" w:color="cccccc" w:sz="6"/>
             </w:tcBorders>
-            <w:shd w:color="auto" w:fill="ffffff" w:val="clear"/>
-            <w:tcMar>
-              <w:left w:w="140" w:type="dxa"/>
-              <w:right w:w="140" w:type="dxa"/>
-            </w:tcMar>
-            <w:vAlign w:val="top"/>
-          </w:tcPr>
-          <w:p>
-            <w:pPr>
-              <w:spacing w:before="0" w:after="0" w:line="520"/>
-              <w:ind w:right="0" w:left="0" w:firstLine="0"/>
-              <w:jc w:val="left"/>
-              <w:rPr>
-                <w:rFonts w:ascii="Calibri" w:hAnsi="Calibri" w:cs="Calibri" w:eastAsia="Calibri"/>
-                <w:color w:val="auto"/>
-                <w:spacing w:val="0"/>
-                <w:position w:val="0"/>
-                <w:sz w:val="22"/>
-                <w:shd w:fill="auto" w:val="clear"/>
-              </w:rPr>
-            </w:pPr>
+            <w:shd w:color="auto" w:fill="f5f5f5" w:val="clear"/>
+            <w:tcMar>
+              <w:left w:w="140" w:type="dxa"/>
+              <w:right w:w="140" w:type="dxa"/>
+            </w:tcMar>
+            <w:vAlign w:val="top"/>
+          </w:tcPr>
+          <w:p>
+            <w:pPr>
+              <w:spacing w:before="0" w:after="0" w:line="520"/>
+              <w:ind w:right="0" w:left="0" w:firstLine="0"/>
+              <w:jc w:val="left"/>
+              <w:rPr>
+                <w:rFonts w:ascii="Calibri" w:hAnsi="Calibri" w:cs="Calibri" w:eastAsia="Calibri"/>
+                <w:color w:val="auto"/>
+                <w:spacing w:val="0"/>
+                <w:position w:val="0"/>
+                <w:sz w:val="22"/>
+                <w:shd w:fill="auto" w:val="clear"/>
+              </w:rPr>
+            </w:pPr>
+            <w:r>
+              <w:rPr>
+                <w:rFonts w:ascii="Calibri" w:hAnsi="Calibri" w:cs="Calibri" w:eastAsia="Calibri"/>
+                <w:color w:val="auto"/>
+                <w:spacing w:val="0"/>
+                <w:position w:val="0"/>
+                <w:sz w:val="22"/>
+                <w:shd w:fill="auto" w:val="clear"/>
+              </w:rPr>
+              <w:t xml:space="preserve">EMPLOYEE,</w:t>
+            </w:r>
+          </w:p>
+          <w:p>
+            <w:pPr>
+              <w:spacing w:before="0" w:after="0" w:line="520"/>
+              <w:ind w:right="0" w:left="0" w:firstLine="0"/>
+              <w:jc w:val="left"/>
+              <w:rPr>
+                <w:rFonts w:ascii="Calibri" w:hAnsi="Calibri" w:cs="Calibri" w:eastAsia="Calibri"/>
+                <w:color w:val="auto"/>
+                <w:spacing w:val="0"/>
+                <w:position w:val="0"/>
+                <w:sz w:val="22"/>
+                <w:shd w:fill="auto" w:val="clear"/>
+              </w:rPr>
+            </w:pPr>
+            <w:r>
+              <w:rPr>
+                <w:rFonts w:ascii="Calibri" w:hAnsi="Calibri" w:cs="Calibri" w:eastAsia="Calibri"/>
+                <w:color w:val="auto"/>
+                <w:spacing w:val="0"/>
+                <w:position w:val="0"/>
+                <w:sz w:val="22"/>
+                <w:shd w:fill="auto" w:val="clear"/>
+              </w:rPr>
+              <w:t xml:space="preserve">DEPENDANT</w:t>
+            </w:r>
           </w:p>
         </w:tc>
         <w:tc>
@@ -15585,27 +16199,38 @@
               <w:bottom w:val="single" w:color="cccccc" w:sz="6"/>
               <w:right w:val="single" w:color="cccccc" w:sz="6"/>
             </w:tcBorders>
-            <w:shd w:color="auto" w:fill="ffffff" w:val="clear"/>
-            <w:tcMar>
-              <w:left w:w="140" w:type="dxa"/>
-              <w:right w:w="140" w:type="dxa"/>
-            </w:tcMar>
-            <w:vAlign w:val="top"/>
-          </w:tcPr>
-          <w:p>
-            <w:pPr>
-              <w:spacing w:before="0" w:after="0" w:line="520"/>
-              <w:ind w:right="0" w:left="0" w:firstLine="0"/>
-              <w:jc w:val="left"/>
-              <w:rPr>
-                <w:rFonts w:ascii="Calibri" w:hAnsi="Calibri" w:cs="Calibri" w:eastAsia="Calibri"/>
-                <w:color w:val="auto"/>
-                <w:spacing w:val="0"/>
-                <w:position w:val="0"/>
-                <w:sz w:val="22"/>
-                <w:shd w:fill="auto" w:val="clear"/>
-              </w:rPr>
-            </w:pPr>
+            <w:shd w:color="auto" w:fill="f5f5f5" w:val="clear"/>
+            <w:tcMar>
+              <w:left w:w="140" w:type="dxa"/>
+              <w:right w:w="140" w:type="dxa"/>
+            </w:tcMar>
+            <w:vAlign w:val="top"/>
+          </w:tcPr>
+          <w:p>
+            <w:pPr>
+              <w:spacing w:before="0" w:after="0" w:line="520"/>
+              <w:ind w:right="0" w:left="0" w:firstLine="0"/>
+              <w:jc w:val="left"/>
+              <w:rPr>
+                <w:rFonts w:ascii="Calibri" w:hAnsi="Calibri" w:cs="Calibri" w:eastAsia="Calibri"/>
+                <w:color w:val="auto"/>
+                <w:spacing w:val="0"/>
+                <w:position w:val="0"/>
+                <w:sz w:val="22"/>
+                <w:shd w:fill="auto" w:val="clear"/>
+              </w:rPr>
+            </w:pPr>
+            <w:r>
+              <w:rPr>
+                <w:rFonts w:ascii="Calibri" w:hAnsi="Calibri" w:cs="Calibri" w:eastAsia="Calibri"/>
+                <w:color w:val="auto"/>
+                <w:spacing w:val="0"/>
+                <w:position w:val="0"/>
+                <w:sz w:val="22"/>
+                <w:shd w:fill="auto" w:val="clear"/>
+              </w:rPr>
+              <w:t xml:space="preserve">Binary</w:t>
+            </w:r>
           </w:p>
         </w:tc>
         <w:tc>
@@ -15617,7 +16242,7 @@
               <w:bottom w:val="single" w:color="cccccc" w:sz="6"/>
               <w:right w:val="single" w:color="cccccc" w:sz="6"/>
             </w:tcBorders>
-            <w:shd w:color="auto" w:fill="ffffff" w:val="clear"/>
+            <w:shd w:color="auto" w:fill="f5f5f5" w:val="clear"/>
             <w:tcMar>
               <w:left w:w="140" w:type="dxa"/>
               <w:right w:w="140" w:type="dxa"/>
@@ -15649,7 +16274,7 @@
               <w:bottom w:val="single" w:color="cccccc" w:sz="6"/>
               <w:right w:val="single" w:color="cccccc" w:sz="6"/>
             </w:tcBorders>
-            <w:shd w:color="auto" w:fill="ffffff" w:val="clear"/>
+            <w:shd w:color="auto" w:fill="f5f5f5" w:val="clear"/>
             <w:tcMar>
               <w:left w:w="140" w:type="dxa"/>
               <w:right w:w="140" w:type="dxa"/>
@@ -15687,7 +16312,7 @@
               <w:bottom w:val="single" w:color="cccccc" w:sz="6"/>
               <w:right w:val="single" w:color="cccccc" w:sz="6"/>
             </w:tcBorders>
-            <w:shd w:color="auto" w:fill="f5f5f5" w:val="clear"/>
+            <w:shd w:color="auto" w:fill="ffffff" w:val="clear"/>
             <w:tcMar>
               <w:left w:w="140" w:type="dxa"/>
               <w:right w:w="140" w:type="dxa"/>
@@ -15702,214 +16327,6 @@
               <w:rPr>
                 <w:spacing w:val="0"/>
                 <w:position w:val="0"/>
-                <w:shd w:fill="auto" w:val="clear"/>
-              </w:rPr>
-            </w:pPr>
-            <w:r>
-              <w:rPr>
-                <w:rFonts w:ascii="Times New Roman" w:hAnsi="Times New Roman" w:cs="Times New Roman" w:eastAsia="Times New Roman"/>
-                <w:b/>
-                <w:color w:val="000000"/>
-                <w:spacing w:val="0"/>
-                <w:position w:val="0"/>
-                <w:sz w:val="24"/>
-                <w:shd w:fill="auto" w:val="clear"/>
-              </w:rPr>
-              <w:t xml:space="preserve">7</w:t>
-            </w:r>
-          </w:p>
-        </w:tc>
-        <w:tc>
-          <w:tcPr>
-            <w:tcW w:w="2074" w:type="dxa"/>
-            <w:tcBorders>
-              <w:top w:val="single" w:color="cccccc" w:sz="6"/>
-              <w:left w:val="single" w:color="cccccc" w:sz="6"/>
-              <w:bottom w:val="single" w:color="cccccc" w:sz="6"/>
-              <w:right w:val="single" w:color="cccccc" w:sz="6"/>
-            </w:tcBorders>
-            <w:shd w:color="auto" w:fill="f5f5f5" w:val="clear"/>
-            <w:tcMar>
-              <w:left w:w="140" w:type="dxa"/>
-              <w:right w:w="140" w:type="dxa"/>
-            </w:tcMar>
-            <w:vAlign w:val="top"/>
-          </w:tcPr>
-          <w:p>
-            <w:pPr>
-              <w:spacing w:before="0" w:after="0" w:line="520"/>
-              <w:ind w:right="0" w:left="0" w:firstLine="0"/>
-              <w:jc w:val="left"/>
-              <w:rPr>
-                <w:rFonts w:ascii="Calibri" w:hAnsi="Calibri" w:cs="Calibri" w:eastAsia="Calibri"/>
-                <w:color w:val="auto"/>
-                <w:spacing w:val="0"/>
-                <w:position w:val="0"/>
-                <w:sz w:val="22"/>
-                <w:shd w:fill="auto" w:val="clear"/>
-              </w:rPr>
-            </w:pPr>
-          </w:p>
-        </w:tc>
-        <w:tc>
-          <w:tcPr>
-            <w:tcW w:w="2084" w:type="dxa"/>
-            <w:tcBorders>
-              <w:top w:val="single" w:color="cccccc" w:sz="6"/>
-              <w:left w:val="single" w:color="cccccc" w:sz="6"/>
-              <w:bottom w:val="single" w:color="cccccc" w:sz="6"/>
-              <w:right w:val="single" w:color="cccccc" w:sz="6"/>
-            </w:tcBorders>
-            <w:shd w:color="auto" w:fill="f5f5f5" w:val="clear"/>
-            <w:tcMar>
-              <w:left w:w="140" w:type="dxa"/>
-              <w:right w:w="140" w:type="dxa"/>
-            </w:tcMar>
-            <w:vAlign w:val="top"/>
-          </w:tcPr>
-          <w:p>
-            <w:pPr>
-              <w:spacing w:before="0" w:after="0" w:line="520"/>
-              <w:ind w:right="0" w:left="0" w:firstLine="0"/>
-              <w:jc w:val="left"/>
-              <w:rPr>
-                <w:rFonts w:ascii="Calibri" w:hAnsi="Calibri" w:cs="Calibri" w:eastAsia="Calibri"/>
-                <w:color w:val="auto"/>
-                <w:spacing w:val="0"/>
-                <w:position w:val="0"/>
-                <w:sz w:val="22"/>
-                <w:shd w:fill="auto" w:val="clear"/>
-              </w:rPr>
-            </w:pPr>
-          </w:p>
-        </w:tc>
-        <w:tc>
-          <w:tcPr>
-            <w:tcW w:w="960" w:type="dxa"/>
-            <w:tcBorders>
-              <w:top w:val="single" w:color="cccccc" w:sz="6"/>
-              <w:left w:val="single" w:color="cccccc" w:sz="6"/>
-              <w:bottom w:val="single" w:color="cccccc" w:sz="6"/>
-              <w:right w:val="single" w:color="cccccc" w:sz="6"/>
-            </w:tcBorders>
-            <w:shd w:color="auto" w:fill="f5f5f5" w:val="clear"/>
-            <w:tcMar>
-              <w:left w:w="140" w:type="dxa"/>
-              <w:right w:w="140" w:type="dxa"/>
-            </w:tcMar>
-            <w:vAlign w:val="top"/>
-          </w:tcPr>
-          <w:p>
-            <w:pPr>
-              <w:spacing w:before="0" w:after="0" w:line="520"/>
-              <w:ind w:right="0" w:left="0" w:firstLine="0"/>
-              <w:jc w:val="left"/>
-              <w:rPr>
-                <w:rFonts w:ascii="Calibri" w:hAnsi="Calibri" w:cs="Calibri" w:eastAsia="Calibri"/>
-                <w:color w:val="auto"/>
-                <w:spacing w:val="0"/>
-                <w:position w:val="0"/>
-                <w:sz w:val="22"/>
-                <w:shd w:fill="auto" w:val="clear"/>
-              </w:rPr>
-            </w:pPr>
-          </w:p>
-        </w:tc>
-        <w:tc>
-          <w:tcPr>
-            <w:tcW w:w="1427" w:type="dxa"/>
-            <w:tcBorders>
-              <w:top w:val="single" w:color="cccccc" w:sz="6"/>
-              <w:left w:val="single" w:color="cccccc" w:sz="6"/>
-              <w:bottom w:val="single" w:color="cccccc" w:sz="6"/>
-              <w:right w:val="single" w:color="cccccc" w:sz="6"/>
-            </w:tcBorders>
-            <w:shd w:color="auto" w:fill="f5f5f5" w:val="clear"/>
-            <w:tcMar>
-              <w:left w:w="140" w:type="dxa"/>
-              <w:right w:w="140" w:type="dxa"/>
-            </w:tcMar>
-            <w:vAlign w:val="top"/>
-          </w:tcPr>
-          <w:p>
-            <w:pPr>
-              <w:spacing w:before="0" w:after="0" w:line="520"/>
-              <w:ind w:right="0" w:left="0" w:firstLine="0"/>
-              <w:jc w:val="left"/>
-              <w:rPr>
-                <w:rFonts w:ascii="Calibri" w:hAnsi="Calibri" w:cs="Calibri" w:eastAsia="Calibri"/>
-                <w:color w:val="auto"/>
-                <w:spacing w:val="0"/>
-                <w:position w:val="0"/>
-                <w:sz w:val="22"/>
-                <w:shd w:fill="auto" w:val="clear"/>
-              </w:rPr>
-            </w:pPr>
-          </w:p>
-        </w:tc>
-        <w:tc>
-          <w:tcPr>
-            <w:tcW w:w="2785" w:type="dxa"/>
-            <w:tcBorders>
-              <w:top w:val="single" w:color="cccccc" w:sz="6"/>
-              <w:left w:val="single" w:color="cccccc" w:sz="6"/>
-              <w:bottom w:val="single" w:color="cccccc" w:sz="6"/>
-              <w:right w:val="single" w:color="cccccc" w:sz="6"/>
-            </w:tcBorders>
-            <w:shd w:color="auto" w:fill="f5f5f5" w:val="clear"/>
-            <w:tcMar>
-              <w:left w:w="140" w:type="dxa"/>
-              <w:right w:w="140" w:type="dxa"/>
-            </w:tcMar>
-            <w:vAlign w:val="top"/>
-          </w:tcPr>
-          <w:p>
-            <w:pPr>
-              <w:spacing w:before="0" w:after="0" w:line="520"/>
-              <w:ind w:right="0" w:left="0" w:firstLine="0"/>
-              <w:jc w:val="left"/>
-              <w:rPr>
-                <w:rFonts w:ascii="Calibri" w:hAnsi="Calibri" w:cs="Calibri" w:eastAsia="Calibri"/>
-                <w:color w:val="auto"/>
-                <w:spacing w:val="0"/>
-                <w:position w:val="0"/>
-                <w:sz w:val="22"/>
-                <w:shd w:fill="auto" w:val="clear"/>
-              </w:rPr>
-            </w:pPr>
-          </w:p>
-        </w:tc>
-      </w:tr>
-      <w:tr>
-        <w:trPr>
-          <w:trHeight w:val="1" w:hRule="atLeast"/>
-          <w:jc w:val="left"/>
-        </w:trPr>
-        <w:tc>
-          <w:tcPr>
-            <w:tcW w:w="416" w:type="dxa"/>
-            <w:tcBorders>
-              <w:top w:val="single" w:color="cccccc" w:sz="6"/>
-              <w:left w:val="single" w:color="cccccc" w:sz="6"/>
-              <w:bottom w:val="single" w:color="cccccc" w:sz="6"/>
-              <w:right w:val="single" w:color="cccccc" w:sz="6"/>
-            </w:tcBorders>
-            <w:shd w:color="auto" w:fill="ffffff" w:val="clear"/>
-            <w:tcMar>
-              <w:left w:w="140" w:type="dxa"/>
-              <w:right w:w="140" w:type="dxa"/>
-            </w:tcMar>
-            <w:vAlign w:val="top"/>
-          </w:tcPr>
-          <w:p>
-            <w:pPr>
-              <w:spacing w:before="0" w:after="0" w:line="300"/>
-              <w:ind w:right="0" w:left="0" w:firstLine="0"/>
-              <w:jc w:val="left"/>
-              <w:rPr>
-                <w:spacing w:val="0"/>
-                <w:position w:val="0"/>
-                <w:shd w:fill="auto" w:val="clear"/>
               </w:rPr>
             </w:pPr>
             <w:r>

</xml_diff>

<commit_message>
Added ERD for ex1
</commit_message>
<xml_diff>
--- a/Lab08 ERD Part2_DaoNguyenPhat_25DH110167.docx
+++ b/Lab08 ERD Part2_DaoNguyenPhat_25DH110167.docx
@@ -5884,10 +5884,10 @@
         <w:jc w:val="left"/>
         <w:rPr>
           <w:rFonts w:ascii="Times New Roman" w:hAnsi="Times New Roman" w:cs="Times New Roman" w:eastAsia="Times New Roman"/>
-          <w:color w:val="auto"/>
+          <w:color w:val="000000"/>
           <w:spacing w:val="0"/>
           <w:position w:val="0"/>
-          <w:sz w:val="26"/>
+          <w:sz w:val="25"/>
           <w:shd w:fill="auto" w:val="clear"/>
         </w:rPr>
       </w:pPr>
@@ -5902,6 +5902,45 @@
         </w:rPr>
         <w:t xml:space="preserve">Draw the complete ERD in ERDPlus using your analysis above. Export as PNG and paste into the area below.</w:t>
       </w:r>
+    </w:p>
+    <w:p>
+      <w:pPr>
+        <w:spacing w:before="60" w:after="80" w:line="240"/>
+        <w:ind w:right="0" w:left="0" w:firstLine="0"/>
+        <w:jc w:val="left"/>
+        <w:rPr>
+          <w:rFonts w:ascii="Times New Roman" w:hAnsi="Times New Roman" w:cs="Times New Roman" w:eastAsia="Times New Roman"/>
+          <w:color w:val="000000"/>
+          <w:spacing w:val="0"/>
+          <w:position w:val="0"/>
+          <w:sz w:val="25"/>
+          <w:shd w:fill="auto" w:val="clear"/>
+        </w:rPr>
+      </w:pPr>
+      <w:r>
+        <w:object w:dxaOrig="8640" w:dyaOrig="7980">
+          <v:rect xmlns:o="urn:schemas-microsoft-com:office:office" xmlns:v="urn:schemas-microsoft-com:vml" id="rectole0000000000" style="width:432.000000pt;height:399.000000pt" o:preferrelative="t" o:ole="">
+            <o:lock v:ext="edit"/>
+            <v:imagedata xmlns:r="http://schemas.openxmlformats.org/officeDocument/2006/relationships" r:id="docRId1" o:title=""/>
+          </v:rect>
+          <o:OLEObject xmlns:r="http://schemas.openxmlformats.org/officeDocument/2006/relationships" xmlns:o="urn:schemas-microsoft-com:office:office" Type="Embed" ProgID="StaticMetafile" DrawAspect="Content" ObjectID="0000000000" ShapeID="rectole0000000000" r:id="docRId0"/>
+        </w:object>
+      </w:r>
+    </w:p>
+    <w:p>
+      <w:pPr>
+        <w:spacing w:before="60" w:after="80" w:line="340"/>
+        <w:ind w:right="0" w:left="0" w:firstLine="0"/>
+        <w:jc w:val="left"/>
+        <w:rPr>
+          <w:rFonts w:ascii="Times New Roman" w:hAnsi="Times New Roman" w:cs="Times New Roman" w:eastAsia="Times New Roman"/>
+          <w:color w:val="auto"/>
+          <w:spacing w:val="0"/>
+          <w:position w:val="0"/>
+          <w:sz w:val="26"/>
+          <w:shd w:fill="auto" w:val="clear"/>
+        </w:rPr>
+      </w:pPr>
     </w:p>
     <w:p>
       <w:pPr>

</xml_diff>

<commit_message>
Added ERD for ex2
</commit_message>
<xml_diff>
--- a/Lab08 ERD Part2_DaoNguyenPhat_25DH110167.docx
+++ b/Lab08 ERD Part2_DaoNguyenPhat_25DH110167.docx
@@ -11116,10 +11116,10 @@
         <w:jc w:val="left"/>
         <w:rPr>
           <w:rFonts w:ascii="Times New Roman" w:hAnsi="Times New Roman" w:cs="Times New Roman" w:eastAsia="Times New Roman"/>
-          <w:color w:val="auto"/>
+          <w:color w:val="000000"/>
           <w:spacing w:val="0"/>
           <w:position w:val="0"/>
-          <w:sz w:val="26"/>
+          <w:sz w:val="25"/>
           <w:shd w:fill="auto" w:val="clear"/>
         </w:rPr>
       </w:pPr>
@@ -11134,6 +11134,45 @@
         </w:rPr>
         <w:t xml:space="preserve">Draw the complete ERD in ERDPlus. Export as PNG and paste below.</w:t>
       </w:r>
+    </w:p>
+    <w:p>
+      <w:pPr>
+        <w:spacing w:before="60" w:after="80" w:line="240"/>
+        <w:ind w:right="0" w:left="0" w:firstLine="0"/>
+        <w:jc w:val="left"/>
+        <w:rPr>
+          <w:rFonts w:ascii="Times New Roman" w:hAnsi="Times New Roman" w:cs="Times New Roman" w:eastAsia="Times New Roman"/>
+          <w:color w:val="000000"/>
+          <w:spacing w:val="0"/>
+          <w:position w:val="0"/>
+          <w:sz w:val="25"/>
+          <w:shd w:fill="auto" w:val="clear"/>
+        </w:rPr>
+      </w:pPr>
+      <w:r>
+        <w:object w:dxaOrig="8640" w:dyaOrig="3915">
+          <v:rect xmlns:o="urn:schemas-microsoft-com:office:office" xmlns:v="urn:schemas-microsoft-com:vml" id="rectole0000000001" style="width:432.000000pt;height:195.750000pt" o:preferrelative="t" o:ole="">
+            <o:lock v:ext="edit"/>
+            <v:imagedata xmlns:r="http://schemas.openxmlformats.org/officeDocument/2006/relationships" r:id="docRId3" o:title=""/>
+          </v:rect>
+          <o:OLEObject xmlns:r="http://schemas.openxmlformats.org/officeDocument/2006/relationships" xmlns:o="urn:schemas-microsoft-com:office:office" Type="Embed" ProgID="StaticMetafile" DrawAspect="Content" ObjectID="0000000001" ShapeID="rectole0000000001" r:id="docRId2"/>
+        </w:object>
+      </w:r>
+    </w:p>
+    <w:p>
+      <w:pPr>
+        <w:spacing w:before="60" w:after="80" w:line="340"/>
+        <w:ind w:right="0" w:left="0" w:firstLine="0"/>
+        <w:jc w:val="left"/>
+        <w:rPr>
+          <w:rFonts w:ascii="Times New Roman" w:hAnsi="Times New Roman" w:cs="Times New Roman" w:eastAsia="Times New Roman"/>
+          <w:color w:val="auto"/>
+          <w:spacing w:val="0"/>
+          <w:position w:val="0"/>
+          <w:sz w:val="26"/>
+          <w:shd w:fill="auto" w:val="clear"/>
+        </w:rPr>
+      </w:pPr>
     </w:p>
     <w:p>
       <w:pPr>

</xml_diff>

<commit_message>
Added ERD for ex3
</commit_message>
<xml_diff>
--- a/Lab08 ERD Part2_DaoNguyenPhat_25DH110167.docx
+++ b/Lab08 ERD Part2_DaoNguyenPhat_25DH110167.docx
@@ -16618,10 +16618,10 @@
         <w:jc w:val="left"/>
         <w:rPr>
           <w:rFonts w:ascii="Times New Roman" w:hAnsi="Times New Roman" w:cs="Times New Roman" w:eastAsia="Times New Roman"/>
-          <w:color w:val="auto"/>
+          <w:color w:val="000000"/>
           <w:spacing w:val="0"/>
           <w:position w:val="0"/>
-          <w:sz w:val="26"/>
+          <w:sz w:val="25"/>
           <w:shd w:fill="auto" w:val="clear"/>
         </w:rPr>
       </w:pPr>
@@ -16637,6 +16637,45 @@
         <w:t xml:space="preserve">Draw the complete ERD in ERDPlus. Export as PNG and paste below.</w:t>
       </w:r>
     </w:p>
+    <w:p>
+      <w:pPr>
+        <w:spacing w:before="60" w:after="80" w:line="240"/>
+        <w:ind w:right="0" w:left="0" w:firstLine="0"/>
+        <w:jc w:val="left"/>
+        <w:rPr>
+          <w:rFonts w:ascii="Times New Roman" w:hAnsi="Times New Roman" w:cs="Times New Roman" w:eastAsia="Times New Roman"/>
+          <w:color w:val="000000"/>
+          <w:spacing w:val="0"/>
+          <w:position w:val="0"/>
+          <w:sz w:val="25"/>
+          <w:shd w:fill="auto" w:val="clear"/>
+        </w:rPr>
+      </w:pPr>
+      <w:r>
+        <w:object w:dxaOrig="8640" w:dyaOrig="3915">
+          <v:rect xmlns:o="urn:schemas-microsoft-com:office:office" xmlns:v="urn:schemas-microsoft-com:vml" id="rectole0000000002" style="width:432.000000pt;height:195.750000pt" o:preferrelative="t" o:ole="">
+            <o:lock v:ext="edit"/>
+            <v:imagedata xmlns:r="http://schemas.openxmlformats.org/officeDocument/2006/relationships" r:id="docRId5" o:title=""/>
+          </v:rect>
+          <o:OLEObject xmlns:r="http://schemas.openxmlformats.org/officeDocument/2006/relationships" xmlns:o="urn:schemas-microsoft-com:office:office" Type="Embed" ProgID="StaticMetafile" DrawAspect="Content" ObjectID="0000000002" ShapeID="rectole0000000002" r:id="docRId4"/>
+        </w:object>
+      </w:r>
+    </w:p>
+    <w:p>
+      <w:pPr>
+        <w:spacing w:before="60" w:after="80" w:line="340"/>
+        <w:ind w:right="0" w:left="0" w:firstLine="0"/>
+        <w:jc w:val="left"/>
+        <w:rPr>
+          <w:rFonts w:ascii="Times New Roman" w:hAnsi="Times New Roman" w:cs="Times New Roman" w:eastAsia="Times New Roman"/>
+          <w:color w:val="auto"/>
+          <w:spacing w:val="0"/>
+          <w:position w:val="0"/>
+          <w:sz w:val="26"/>
+          <w:shd w:fill="auto" w:val="clear"/>
+        </w:rPr>
+      </w:pPr>
+    </w:p>
   </w:body>
 </w:document>
 </file>

</xml_diff>